<commit_message>
resume: rebuild docx and pdf from regenerated markdown
</commit_message>
<xml_diff>
--- a/static/nathan-genetzky-resume.docx
+++ b/static/nathan-genetzky-resume.docx
@@ -61,86 +61,91 @@
         <w:pStyle w:val="Date"/>
       </w:pPr>
       <w:r>
-        <w:t xml:space="preserve">2024-01-04</w:t>
-      </w:r>
-    </w:p>
+        <w:t xml:space="preserve">2026-09-22</w:t>
+      </w:r>
+    </w:p>
+    <w:bookmarkStart w:id="20" w:name="career-profile"/>
     <w:p>
       <w:pPr>
         <w:pStyle w:val="Heading2"/>
       </w:pPr>
-      <w:bookmarkStart w:id="20" w:name="career-profile"/>
       <w:r>
         <w:t xml:space="preserve">Career Profile</w:t>
       </w:r>
-      <w:bookmarkEnd w:id="20"/>
-    </w:p>
-    <w:p>
-      <w:pPr>
+    </w:p>
+    <w:p>
+      <w:pPr>
+        <w:pStyle w:val="Compact"/>
         <w:numPr>
           <w:ilvl w:val="0"/>
           <w:numId w:val="1001"/>
         </w:numPr>
-        <w:pStyle w:val="Compact"/>
-      </w:pPr>
-      <w:r>
-        <w:t xml:space="preserve">Electrical Engineer graduate with honors distinction.</w:t>
-      </w:r>
-    </w:p>
-    <w:p>
-      <w:pPr>
+      </w:pPr>
+      <w:r>
+        <w:t xml:space="preserve">Embedded Linux engineer with ~9 years taking connected products from board</w:t>
+      </w:r>
+      <w:r>
+        <w:t xml:space="preserve"> </w:t>
+      </w:r>
+      <w:r>
+        <w:t xml:space="preserve">bring-up through secure, field-updatable deployment.</w:t>
+      </w:r>
+    </w:p>
+    <w:p>
+      <w:pPr>
+        <w:pStyle w:val="Compact"/>
         <w:numPr>
           <w:ilvl w:val="0"/>
           <w:numId w:val="1001"/>
         </w:numPr>
-        <w:pStyle w:val="Compact"/>
-      </w:pPr>
-      <w:r>
-        <w:t xml:space="preserve">Worked as independent contractor twice during college.</w:t>
-      </w:r>
-    </w:p>
-    <w:p>
-      <w:pPr>
+      </w:pPr>
+      <w:r>
+        <w:t xml:space="preserve">Yocto distributions, BSP and kernel work, CI/CD, and hardware-in-the-loop test.</w:t>
+      </w:r>
+    </w:p>
+    <w:p>
+      <w:pPr>
+        <w:pStyle w:val="Compact"/>
         <w:numPr>
           <w:ilvl w:val="0"/>
           <w:numId w:val="1001"/>
         </w:numPr>
-        <w:pStyle w:val="Compact"/>
-      </w:pPr>
-      <w:r>
-        <w:t xml:space="preserve">Experience working as software engineer for two years during college.</w:t>
-      </w:r>
-    </w:p>
-    <w:p>
-      <w:pPr>
+      </w:pPr>
+      <w:r>
+        <w:t xml:space="preserve">Product cybersecurity (EN 18031 / EU RED, secure boot, SBOM) and OTA update systems.</w:t>
+      </w:r>
+    </w:p>
+    <w:p>
+      <w:pPr>
+        <w:pStyle w:val="Compact"/>
         <w:numPr>
           <w:ilvl w:val="0"/>
           <w:numId w:val="1001"/>
         </w:numPr>
-        <w:pStyle w:val="Compact"/>
-      </w:pPr>
-      <w:r>
-        <w:t xml:space="preserve">Learned Android, Python, Git and Linux command line tools from on-line tutorials/videos.</w:t>
-      </w:r>
-    </w:p>
+      </w:pPr>
+      <w:r>
+        <w:t xml:space="preserve">Electrical Engineering graduate with honors distinction.</w:t>
+      </w:r>
+    </w:p>
+    <w:bookmarkEnd w:id="20"/>
+    <w:bookmarkStart w:id="27" w:name="contact"/>
     <w:p>
       <w:pPr>
         <w:pStyle w:val="Heading2"/>
       </w:pPr>
-      <w:bookmarkStart w:id="21" w:name="contact"/>
       <w:r>
         <w:t xml:space="preserve">Contact</w:t>
       </w:r>
-      <w:bookmarkEnd w:id="21"/>
-    </w:p>
-    <w:p>
-      <w:pPr>
+    </w:p>
+    <w:p>
+      <w:pPr>
+        <w:pStyle w:val="Compact"/>
         <w:numPr>
           <w:ilvl w:val="0"/>
           <w:numId w:val="1002"/>
         </w:numPr>
-        <w:pStyle w:val="Compact"/>
-      </w:pPr>
-      <w:hyperlink r:id="rId22">
+      </w:pPr>
+      <w:hyperlink r:id="rId21">
         <w:r>
           <w:rPr>
             <w:rStyle w:val="Hyperlink"/>
@@ -151,13 +156,13 @@
     </w:p>
     <w:p>
       <w:pPr>
+        <w:pStyle w:val="Compact"/>
         <w:numPr>
           <w:ilvl w:val="0"/>
           <w:numId w:val="1002"/>
         </w:numPr>
-        <w:pStyle w:val="Compact"/>
-      </w:pPr>
-      <w:hyperlink r:id="rId23">
+      </w:pPr>
+      <w:hyperlink r:id="rId22">
         <w:r>
           <w:rPr>
             <w:rStyle w:val="Hyperlink"/>
@@ -168,13 +173,13 @@
     </w:p>
     <w:p>
       <w:pPr>
+        <w:pStyle w:val="Compact"/>
         <w:numPr>
           <w:ilvl w:val="0"/>
           <w:numId w:val="1002"/>
         </w:numPr>
-        <w:pStyle w:val="Compact"/>
-      </w:pPr>
-      <w:hyperlink r:id="rId24">
+      </w:pPr>
+      <w:hyperlink r:id="rId23">
         <w:r>
           <w:rPr>
             <w:rStyle w:val="Hyperlink"/>
@@ -185,13 +190,13 @@
     </w:p>
     <w:p>
       <w:pPr>
+        <w:pStyle w:val="Compact"/>
         <w:numPr>
           <w:ilvl w:val="0"/>
           <w:numId w:val="1002"/>
         </w:numPr>
-        <w:pStyle w:val="Compact"/>
-      </w:pPr>
-      <w:hyperlink r:id="rId25">
+      </w:pPr>
+      <w:hyperlink r:id="rId24">
         <w:r>
           <w:rPr>
             <w:rStyle w:val="Hyperlink"/>
@@ -202,13 +207,13 @@
     </w:p>
     <w:p>
       <w:pPr>
+        <w:pStyle w:val="Compact"/>
         <w:numPr>
           <w:ilvl w:val="0"/>
           <w:numId w:val="1002"/>
         </w:numPr>
-        <w:pStyle w:val="Compact"/>
-      </w:pPr>
-      <w:hyperlink r:id="rId26">
+      </w:pPr>
+      <w:hyperlink r:id="rId25">
         <w:r>
           <w:rPr>
             <w:rStyle w:val="Hyperlink"/>
@@ -219,13 +224,13 @@
     </w:p>
     <w:p>
       <w:pPr>
+        <w:pStyle w:val="Compact"/>
         <w:numPr>
           <w:ilvl w:val="0"/>
           <w:numId w:val="1002"/>
         </w:numPr>
-        <w:pStyle w:val="Compact"/>
-      </w:pPr>
-      <w:hyperlink r:id="rId27">
+      </w:pPr>
+      <w:hyperlink r:id="rId26">
         <w:r>
           <w:rPr>
             <w:rStyle w:val="Hyperlink"/>
@@ -234,53 +239,214 @@
         </w:r>
       </w:hyperlink>
     </w:p>
+    <w:bookmarkEnd w:id="27"/>
+    <w:bookmarkStart w:id="32" w:name="experiences"/>
     <w:p>
       <w:pPr>
         <w:pStyle w:val="Heading2"/>
       </w:pPr>
-      <w:bookmarkStart w:id="28" w:name="experiences"/>
       <w:r>
         <w:t xml:space="preserve">Experiences</w:t>
       </w:r>
-      <w:bookmarkEnd w:id="28"/>
-    </w:p>
+    </w:p>
+    <w:bookmarkStart w:id="28" w:name="senior-software-engineer"/>
     <w:p>
       <w:pPr>
         <w:pStyle w:val="Heading4"/>
       </w:pPr>
-      <w:bookmarkStart w:id="29" w:name="senior-software-engineer"/>
       <w:r>
         <w:t xml:space="preserve">Senior Software Engineer</w:t>
       </w:r>
-      <w:bookmarkEnd w:id="29"/>
     </w:p>
     <w:p>
       <w:pPr>
         <w:pStyle w:val="FirstParagraph"/>
       </w:pPr>
       <w:r>
-        <w:t xml:space="preserve">ESW Team at Appareo Systems (12.2021 - PRESENT)</w:t>
-      </w:r>
-    </w:p>
-    <w:p>
-      <w:pPr>
+        <w:t xml:space="preserve">PTx, AGCO’s Precision Agriculture Technology business (04.2024 - PRESENT)</w:t>
+      </w:r>
+    </w:p>
+    <w:p>
+      <w:pPr>
+        <w:pStyle w:val="Compact"/>
         <w:numPr>
           <w:ilvl w:val="0"/>
           <w:numId w:val="1003"/>
         </w:numPr>
-        <w:pStyle w:val="Compact"/>
-      </w:pPr>
-      <w:r>
-        <w:t xml:space="preserve">Performed board bring-up for custom PCB with heterogeneous SOC (IMX8DXL).</w:t>
-      </w:r>
-    </w:p>
-    <w:p>
-      <w:pPr>
+      </w:pPr>
+      <w:r>
+        <w:t xml:space="preserve">Develop embedded Linux platforms for agricultural equipment electronics;</w:t>
+      </w:r>
+      <w:r>
+        <w:t xml:space="preserve"> </w:t>
+      </w:r>
+      <w:r>
+        <w:t xml:space="preserve">working knowledge of CAN bus and protocol.</w:t>
+      </w:r>
+    </w:p>
+    <w:p>
+      <w:pPr>
+        <w:pStyle w:val="Compact"/>
         <w:numPr>
           <w:ilvl w:val="0"/>
           <w:numId w:val="1003"/>
         </w:numPr>
-        <w:pStyle w:val="Compact"/>
+      </w:pPr>
+      <w:r>
+        <w:t xml:space="preserve">Applied EN 18031 (EU RED cybersecurity) to a connected product: asset</w:t>
+      </w:r>
+      <w:r>
+        <w:t xml:space="preserve"> </w:t>
+      </w:r>
+      <w:r>
+        <w:t xml:space="preserve">identification, decision-tree assessment, and evidence for third-party</w:t>
+      </w:r>
+      <w:r>
+        <w:t xml:space="preserve"> </w:t>
+      </w:r>
+      <w:r>
+        <w:t xml:space="preserve">certification; tracking CRA readiness.</w:t>
+      </w:r>
+    </w:p>
+    <w:p>
+      <w:pPr>
+        <w:pStyle w:val="Compact"/>
+        <w:numPr>
+          <w:ilvl w:val="0"/>
+          <w:numId w:val="1003"/>
+        </w:numPr>
+      </w:pPr>
+      <w:r>
+        <w:t xml:space="preserve">Implemented secure boot and signed firmware images; performed threat modeling</w:t>
+      </w:r>
+      <w:r>
+        <w:t xml:space="preserve"> </w:t>
+      </w:r>
+      <w:r>
+        <w:t xml:space="preserve">and key management backed by a hardware security element.</w:t>
+      </w:r>
+    </w:p>
+    <w:p>
+      <w:pPr>
+        <w:pStyle w:val="Compact"/>
+        <w:numPr>
+          <w:ilvl w:val="0"/>
+          <w:numId w:val="1003"/>
+        </w:numPr>
+      </w:pPr>
+      <w:r>
+        <w:t xml:space="preserve">Generate and maintain SBOMs for a Yocto-based product.</w:t>
+      </w:r>
+    </w:p>
+    <w:p>
+      <w:pPr>
+        <w:pStyle w:val="Compact"/>
+        <w:numPr>
+          <w:ilvl w:val="0"/>
+          <w:numId w:val="1003"/>
+        </w:numPr>
+      </w:pPr>
+      <w:r>
+        <w:t xml:space="preserve">Evaluated RAUC, Mender, and OSTree against product constraints and authored a</w:t>
+      </w:r>
+      <w:r>
+        <w:t xml:space="preserve"> </w:t>
+      </w:r>
+      <w:r>
+        <w:t xml:space="preserve">custom update agent where none fit; A/B partitioning, atomic updates, and</w:t>
+      </w:r>
+      <w:r>
+        <w:t xml:space="preserve"> </w:t>
+      </w:r>
+      <w:r>
+        <w:t xml:space="preserve">rollback-safe failure handling.</w:t>
+      </w:r>
+    </w:p>
+    <w:p>
+      <w:pPr>
+        <w:pStyle w:val="Compact"/>
+        <w:numPr>
+          <w:ilvl w:val="0"/>
+          <w:numId w:val="1003"/>
+        </w:numPr>
+      </w:pPr>
+      <w:r>
+        <w:t xml:space="preserve">Manage fleets with Balena: device provisioning, remote access, and delivery of</w:t>
+      </w:r>
+      <w:r>
+        <w:t xml:space="preserve"> </w:t>
+      </w:r>
+      <w:r>
+        <w:t xml:space="preserve">containerized applications running on embedded targets.</w:t>
+      </w:r>
+    </w:p>
+    <w:p>
+      <w:pPr>
+        <w:pStyle w:val="Compact"/>
+        <w:numPr>
+          <w:ilvl w:val="0"/>
+          <w:numId w:val="1003"/>
+        </w:numPr>
+      </w:pPr>
+      <w:r>
+        <w:t xml:space="preserve">Integrated AI-assisted development into daily embedded workflow for code</w:t>
+      </w:r>
+      <w:r>
+        <w:t xml:space="preserve"> </w:t>
+      </w:r>
+      <w:r>
+        <w:t xml:space="preserve">generation, review, test authoring, and documentation, with defined boundaries</w:t>
+      </w:r>
+      <w:r>
+        <w:t xml:space="preserve"> </w:t>
+      </w:r>
+      <w:r>
+        <w:t xml:space="preserve">on where generated code is not trusted without verification.</w:t>
+      </w:r>
+    </w:p>
+    <w:bookmarkEnd w:id="28"/>
+    <w:bookmarkStart w:id="29" w:name="senior-software-engineer-1"/>
+    <w:p>
+      <w:pPr>
+        <w:pStyle w:val="Heading4"/>
+      </w:pPr>
+      <w:r>
+        <w:t xml:space="preserve">Senior Software Engineer</w:t>
+      </w:r>
+    </w:p>
+    <w:p>
+      <w:pPr>
+        <w:pStyle w:val="FirstParagraph"/>
+      </w:pPr>
+      <w:r>
+        <w:t xml:space="preserve">ESW Team at Appareo Systems (acquired by AGCO, 01.2022) (12.2021 - 04.2024)</w:t>
+      </w:r>
+    </w:p>
+    <w:p>
+      <w:pPr>
+        <w:pStyle w:val="Compact"/>
+        <w:numPr>
+          <w:ilvl w:val="0"/>
+          <w:numId w:val="1004"/>
+        </w:numPr>
+      </w:pPr>
+      <w:r>
+        <w:t xml:space="preserve">Performed board bring-up for custom PCB with heterogeneous SOC (IMX8DXL),</w:t>
+      </w:r>
+      <w:r>
+        <w:t xml:space="preserve"> </w:t>
+      </w:r>
+      <w:r>
+        <w:t xml:space="preserve">debugging with JTAG/SWD, GDB, logic analyzer, and oscilloscope.</w:t>
+      </w:r>
+    </w:p>
+    <w:p>
+      <w:pPr>
+        <w:pStyle w:val="Compact"/>
+        <w:numPr>
+          <w:ilvl w:val="0"/>
+          <w:numId w:val="1004"/>
+        </w:numPr>
       </w:pPr>
       <w:r>
         <w:t xml:space="preserve">Integrated drivers for cellular modems, WiFi, and bluetooth.</w:t>
@@ -288,35 +454,29 @@
     </w:p>
     <w:p>
       <w:pPr>
-        <w:numPr>
-          <w:ilvl w:val="0"/>
-          <w:numId w:val="1003"/>
-        </w:numPr>
-        <w:pStyle w:val="Compact"/>
-      </w:pPr>
-      <w:r>
-        <w:t xml:space="preserve">Setup dockerized Jenkins with both manual and GitOps centric builds.</w:t>
-      </w:r>
-    </w:p>
-    <w:p>
-      <w:pPr>
-        <w:numPr>
-          <w:ilvl w:val="0"/>
-          <w:numId w:val="1003"/>
-        </w:numPr>
-        <w:pStyle w:val="Compact"/>
-      </w:pPr>
-      <w:r>
-        <w:t xml:space="preserve">Utilized Gitflow including automated build and deployment of releases.</w:t>
-      </w:r>
-    </w:p>
-    <w:p>
-      <w:pPr>
-        <w:numPr>
-          <w:ilvl w:val="0"/>
-          <w:numId w:val="1003"/>
-        </w:numPr>
-        <w:pStyle w:val="Compact"/>
+        <w:pStyle w:val="Compact"/>
+        <w:numPr>
+          <w:ilvl w:val="0"/>
+          <w:numId w:val="1004"/>
+        </w:numPr>
+      </w:pPr>
+      <w:r>
+        <w:t xml:space="preserve">Setup dockerized Jenkins with manual and GitOps centric builds, using Gitflow</w:t>
+      </w:r>
+      <w:r>
+        <w:t xml:space="preserve"> </w:t>
+      </w:r>
+      <w:r>
+        <w:t xml:space="preserve">with automated build and deployment of releases.</w:t>
+      </w:r>
+    </w:p>
+    <w:p>
+      <w:pPr>
+        <w:pStyle w:val="Compact"/>
+        <w:numPr>
+          <w:ilvl w:val="0"/>
+          <w:numId w:val="1004"/>
+        </w:numPr>
       </w:pPr>
       <w:r>
         <w:t xml:space="preserve">Developed and utilized HIL testing with Labgrid on RPI4.</w:t>
@@ -324,25 +484,25 @@
     </w:p>
     <w:p>
       <w:pPr>
-        <w:numPr>
-          <w:ilvl w:val="0"/>
-          <w:numId w:val="1003"/>
-        </w:numPr>
-        <w:pStyle w:val="Compact"/>
+        <w:pStyle w:val="Compact"/>
+        <w:numPr>
+          <w:ilvl w:val="0"/>
+          <w:numId w:val="1004"/>
+        </w:numPr>
       </w:pPr>
       <w:r>
         <w:t xml:space="preserve">Generated SDKs and docker images for quick cross-compilation of C++ Applications.</w:t>
       </w:r>
     </w:p>
+    <w:bookmarkEnd w:id="29"/>
+    <w:bookmarkStart w:id="30" w:name="software-engineer-1"/>
     <w:p>
       <w:pPr>
         <w:pStyle w:val="Heading4"/>
       </w:pPr>
-      <w:bookmarkStart w:id="30" w:name="software-engineer-1"/>
       <w:r>
         <w:t xml:space="preserve">Software Engineer 1</w:t>
       </w:r>
-      <w:bookmarkEnd w:id="30"/>
     </w:p>
     <w:p>
       <w:pPr>
@@ -354,11 +514,11 @@
     </w:p>
     <w:p>
       <w:pPr>
-        <w:numPr>
-          <w:ilvl w:val="0"/>
-          <w:numId w:val="1004"/>
-        </w:numPr>
-        <w:pStyle w:val="Compact"/>
+        <w:pStyle w:val="Compact"/>
+        <w:numPr>
+          <w:ilvl w:val="0"/>
+          <w:numId w:val="1005"/>
+        </w:numPr>
       </w:pPr>
       <w:r>
         <w:t xml:space="preserve">Working with FPGA and python developers to create an integrated embedded</w:t>
@@ -372,11 +532,11 @@
     </w:p>
     <w:p>
       <w:pPr>
-        <w:numPr>
-          <w:ilvl w:val="0"/>
-          <w:numId w:val="1004"/>
-        </w:numPr>
-        <w:pStyle w:val="Compact"/>
+        <w:pStyle w:val="Compact"/>
+        <w:numPr>
+          <w:ilvl w:val="0"/>
+          <w:numId w:val="1005"/>
+        </w:numPr>
       </w:pPr>
       <w:r>
         <w:t xml:space="preserve">I help to build a custom Linux distribution from the</w:t>
@@ -402,11 +562,11 @@
     </w:p>
     <w:p>
       <w:pPr>
-        <w:numPr>
-          <w:ilvl w:val="0"/>
-          <w:numId w:val="1004"/>
-        </w:numPr>
-        <w:pStyle w:val="Compact"/>
+        <w:pStyle w:val="Compact"/>
+        <w:numPr>
+          <w:ilvl w:val="0"/>
+          <w:numId w:val="1005"/>
+        </w:numPr>
       </w:pPr>
       <w:r>
         <w:t xml:space="preserve">Our team uses many other tools during development such as Jenkins, Jira,</w:t>
@@ -418,15 +578,15 @@
         <w:t xml:space="preserve">Git, Bitbake, and Puppet.</w:t>
       </w:r>
     </w:p>
+    <w:bookmarkEnd w:id="30"/>
+    <w:bookmarkStart w:id="31" w:name="software-engineer"/>
     <w:p>
       <w:pPr>
         <w:pStyle w:val="Heading4"/>
       </w:pPr>
-      <w:bookmarkStart w:id="31" w:name="software-engineer"/>
       <w:r>
         <w:t xml:space="preserve">Software Engineer</w:t>
       </w:r>
-      <w:bookmarkEnd w:id="31"/>
     </w:p>
     <w:p>
       <w:pPr>
@@ -438,11 +598,11 @@
     </w:p>
     <w:p>
       <w:pPr>
-        <w:numPr>
-          <w:ilvl w:val="0"/>
-          <w:numId w:val="1005"/>
-        </w:numPr>
-        <w:pStyle w:val="Compact"/>
+        <w:pStyle w:val="Compact"/>
+        <w:numPr>
+          <w:ilvl w:val="0"/>
+          <w:numId w:val="1006"/>
+        </w:numPr>
       </w:pPr>
       <w:r>
         <w:t xml:space="preserve">Develop embedded software for Particle, Nordic, and STM32 microcontrollers</w:t>
@@ -450,11 +610,11 @@
     </w:p>
     <w:p>
       <w:pPr>
-        <w:numPr>
-          <w:ilvl w:val="0"/>
-          <w:numId w:val="1005"/>
-        </w:numPr>
-        <w:pStyle w:val="Compact"/>
+        <w:pStyle w:val="Compact"/>
+        <w:numPr>
+          <w:ilvl w:val="0"/>
+          <w:numId w:val="1006"/>
+        </w:numPr>
       </w:pPr>
       <w:r>
         <w:t xml:space="preserve">Utilized custom hardware with the Particle platform for a custom door access solution</w:t>
@@ -462,103 +622,43 @@
     </w:p>
     <w:p>
       <w:pPr>
-        <w:numPr>
-          <w:ilvl w:val="0"/>
-          <w:numId w:val="1005"/>
-        </w:numPr>
-        <w:pStyle w:val="Compact"/>
+        <w:pStyle w:val="Compact"/>
+        <w:numPr>
+          <w:ilvl w:val="0"/>
+          <w:numId w:val="1006"/>
+        </w:numPr>
       </w:pPr>
       <w:r>
         <w:t xml:space="preserve">Developed with NRF52 SDK to create devices in a complex robotic system with BLE services</w:t>
       </w:r>
     </w:p>
+    <w:bookmarkEnd w:id="31"/>
+    <w:bookmarkEnd w:id="32"/>
+    <w:bookmarkStart w:id="44" w:name="projects"/>
+    <w:p>
+      <w:pPr>
+        <w:pStyle w:val="Heading2"/>
+      </w:pPr>
+      <w:r>
+        <w:t xml:space="preserve">Projects</w:t>
+      </w:r>
+    </w:p>
+    <w:bookmarkStart w:id="34" w:name="Xf974c0d12b9b8cbd394ec49fb57f23955fed171"/>
     <w:p>
       <w:pPr>
         <w:pStyle w:val="Heading4"/>
       </w:pPr>
-      <w:bookmarkStart w:id="32" w:name="student-intern"/>
-      <w:r>
-        <w:t xml:space="preserve">Student Intern</w:t>
-      </w:r>
-      <w:bookmarkEnd w:id="32"/>
-    </w:p>
-    <w:p>
-      <w:pPr>
-        <w:pStyle w:val="FirstParagraph"/>
-      </w:pPr>
-      <w:r>
-        <w:t xml:space="preserve">Hardware Design at Daktronics (05.2016 - 05.2017)</w:t>
-      </w:r>
-    </w:p>
-    <w:p>
-      <w:pPr>
-        <w:numPr>
-          <w:ilvl w:val="0"/>
-          <w:numId w:val="1006"/>
-        </w:numPr>
-        <w:pStyle w:val="Compact"/>
-      </w:pPr>
-      <w:r>
-        <w:t xml:space="preserve">Developed C++ code for communication with I2C sensors from a Linux system.</w:t>
-      </w:r>
-    </w:p>
-    <w:p>
-      <w:pPr>
-        <w:numPr>
-          <w:ilvl w:val="0"/>
-          <w:numId w:val="1006"/>
-        </w:numPr>
-        <w:pStyle w:val="Compact"/>
-      </w:pPr>
-      <w:r>
-        <w:t xml:space="preserve">Developed a C++ library that simplifies usage of librrd, a C library for</w:t>
-      </w:r>
-      <w:r>
-        <w:t xml:space="preserve"> </w:t>
-      </w:r>
-      <w:r>
-        <w:t xml:space="preserve">creating, updating, and using RRDs (Round Robin Databases).</w:t>
-      </w:r>
-    </w:p>
-    <w:p>
-      <w:pPr>
-        <w:numPr>
-          <w:ilvl w:val="0"/>
-          <w:numId w:val="1006"/>
-        </w:numPr>
-        <w:pStyle w:val="Compact"/>
-      </w:pPr>
-      <w:r>
-        <w:t xml:space="preserve">Used Test Driven Development to implement library, used CxxTest Framework.</w:t>
-      </w:r>
-    </w:p>
-    <w:p>
-      <w:pPr>
-        <w:pStyle w:val="Heading2"/>
-      </w:pPr>
-      <w:bookmarkStart w:id="33" w:name="projects"/>
-      <w:r>
-        <w:t xml:space="preserve">Projects</w:t>
-      </w:r>
-      <w:bookmarkEnd w:id="33"/>
-    </w:p>
-    <w:p>
-      <w:pPr>
-        <w:pStyle w:val="Heading4"/>
-      </w:pPr>
-      <w:bookmarkStart w:id="34" w:name="Xf974c0d12b9b8cbd394ec49fb57f23955fed171"/>
       <w:r>
         <w:t xml:space="preserve">Hardware Integrated Prototyping Environment at SDSU Engineering Expo</w:t>
       </w:r>
-      <w:bookmarkEnd w:id="34"/>
-    </w:p>
-    <w:p>
-      <w:pPr>
+    </w:p>
+    <w:p>
+      <w:pPr>
+        <w:pStyle w:val="Compact"/>
         <w:numPr>
           <w:ilvl w:val="0"/>
           <w:numId w:val="1007"/>
         </w:numPr>
-        <w:pStyle w:val="Compact"/>
       </w:pPr>
       <w:r>
         <w:t xml:space="preserve">Nathan Genetzky, Jordan Ulmer, Tanner Johnson (SDSU, 2017)</w:t>
@@ -566,13 +666,13 @@
     </w:p>
     <w:p>
       <w:pPr>
+        <w:pStyle w:val="Compact"/>
         <w:numPr>
           <w:ilvl w:val="0"/>
           <w:numId w:val="1007"/>
         </w:numPr>
-        <w:pStyle w:val="Compact"/>
-      </w:pPr>
-      <w:hyperlink r:id="rId35">
+      </w:pPr>
+      <w:hyperlink r:id="rId33">
         <w:r>
           <w:rPr>
             <w:rStyle w:val="Hyperlink"/>
@@ -581,23 +681,23 @@
         </w:r>
       </w:hyperlink>
     </w:p>
+    <w:bookmarkEnd w:id="34"/>
+    <w:bookmarkStart w:id="35" w:name="X3d3d2f335dee6258fac26945b027a3aa4174c3b"/>
     <w:p>
       <w:pPr>
         <w:pStyle w:val="Heading4"/>
       </w:pPr>
-      <w:bookmarkStart w:id="36" w:name="X3d3d2f335dee6258fac26945b027a3aa4174c3b"/>
       <w:r>
         <w:t xml:space="preserve">Design and Verification of a SPI to JTAG Interface Adapter</w:t>
       </w:r>
-      <w:bookmarkEnd w:id="36"/>
-    </w:p>
-    <w:p>
-      <w:pPr>
+    </w:p>
+    <w:p>
+      <w:pPr>
+        <w:pStyle w:val="Compact"/>
         <w:numPr>
           <w:ilvl w:val="0"/>
           <w:numId w:val="1008"/>
         </w:numPr>
-        <w:pStyle w:val="Compact"/>
       </w:pPr>
       <w:r>
         <w:t xml:space="preserve">Nathan Genetzky, Jordan Ulmer (SDSU, 2017)</w:t>
@@ -605,13 +705,13 @@
     </w:p>
     <w:p>
       <w:pPr>
+        <w:pStyle w:val="Compact"/>
         <w:numPr>
           <w:ilvl w:val="0"/>
           <w:numId w:val="1008"/>
         </w:numPr>
-        <w:pStyle w:val="Compact"/>
-      </w:pPr>
-      <w:hyperlink r:id="rId35">
+      </w:pPr>
+      <w:hyperlink r:id="rId33">
         <w:r>
           <w:rPr>
             <w:rStyle w:val="Hyperlink"/>
@@ -620,23 +720,23 @@
         </w:r>
       </w:hyperlink>
     </w:p>
+    <w:bookmarkEnd w:id="35"/>
+    <w:bookmarkStart w:id="36" w:name="X88a4495dfd18e3ff5fd7b652851687dfea54d21"/>
     <w:p>
       <w:pPr>
         <w:pStyle w:val="Heading4"/>
       </w:pPr>
-      <w:bookmarkStart w:id="37" w:name="X88a4495dfd18e3ff5fd7b652851687dfea54d21"/>
       <w:r>
         <w:t xml:space="preserve">Interactive User Interface with PIC18 Microcontroller</w:t>
       </w:r>
-      <w:bookmarkEnd w:id="37"/>
-    </w:p>
-    <w:p>
-      <w:pPr>
+    </w:p>
+    <w:p>
+      <w:pPr>
+        <w:pStyle w:val="Compact"/>
         <w:numPr>
           <w:ilvl w:val="0"/>
           <w:numId w:val="1009"/>
         </w:numPr>
-        <w:pStyle w:val="Compact"/>
       </w:pPr>
       <w:r>
         <w:t xml:space="preserve">Nathan Genetzky, Drake Jeno (SDSU, 2017)</w:t>
@@ -644,13 +744,13 @@
     </w:p>
     <w:p>
       <w:pPr>
+        <w:pStyle w:val="Compact"/>
         <w:numPr>
           <w:ilvl w:val="0"/>
           <w:numId w:val="1009"/>
         </w:numPr>
-        <w:pStyle w:val="Compact"/>
-      </w:pPr>
-      <w:hyperlink r:id="rId35">
+      </w:pPr>
+      <w:hyperlink r:id="rId33">
         <w:r>
           <w:rPr>
             <w:rStyle w:val="Hyperlink"/>
@@ -659,23 +759,23 @@
         </w:r>
       </w:hyperlink>
     </w:p>
+    <w:bookmarkEnd w:id="36"/>
+    <w:bookmarkStart w:id="37" w:name="particle-projects"/>
     <w:p>
       <w:pPr>
         <w:pStyle w:val="Heading4"/>
       </w:pPr>
-      <w:bookmarkStart w:id="38" w:name="particle-projects"/>
       <w:r>
         <w:t xml:space="preserve">Particle Projects</w:t>
       </w:r>
-      <w:bookmarkEnd w:id="38"/>
-    </w:p>
-    <w:p>
-      <w:pPr>
+    </w:p>
+    <w:p>
+      <w:pPr>
+        <w:pStyle w:val="Compact"/>
         <w:numPr>
           <w:ilvl w:val="0"/>
           <w:numId w:val="1010"/>
         </w:numPr>
-        <w:pStyle w:val="Compact"/>
       </w:pPr>
       <w:r>
         <w:t xml:space="preserve">Firmware for micro controllers sold by particle.io for use with wifi or cellular cloud devices.</w:t>
@@ -683,13 +783,13 @@
     </w:p>
     <w:p>
       <w:pPr>
+        <w:pStyle w:val="Compact"/>
         <w:numPr>
           <w:ilvl w:val="0"/>
           <w:numId w:val="1010"/>
         </w:numPr>
-        <w:pStyle w:val="Compact"/>
-      </w:pPr>
-      <w:hyperlink r:id="rId35">
+      </w:pPr>
+      <w:hyperlink r:id="rId33">
         <w:r>
           <w:rPr>
             <w:rStyle w:val="Hyperlink"/>
@@ -698,23 +798,23 @@
         </w:r>
       </w:hyperlink>
     </w:p>
+    <w:bookmarkEnd w:id="37"/>
+    <w:bookmarkStart w:id="38" w:name="skills-proficiency"/>
     <w:p>
       <w:pPr>
         <w:pStyle w:val="Heading3"/>
       </w:pPr>
-      <w:bookmarkStart w:id="39" w:name="skills-proficiency"/>
       <w:r>
         <w:t xml:space="preserve">Skills &amp; Proficiency</w:t>
       </w:r>
-      <w:bookmarkEnd w:id="39"/>
-    </w:p>
-    <w:p>
-      <w:pPr>
+    </w:p>
+    <w:p>
+      <w:pPr>
+        <w:pStyle w:val="Compact"/>
         <w:numPr>
           <w:ilvl w:val="0"/>
           <w:numId w:val="1011"/>
         </w:numPr>
-        <w:pStyle w:val="Compact"/>
       </w:pPr>
       <w:r>
         <w:t xml:space="preserve">Yocto (Build System, Embedded Distro, BSP Support) (90%)</w:t>
@@ -722,23 +822,23 @@
     </w:p>
     <w:p>
       <w:pPr>
+        <w:pStyle w:val="Compact"/>
         <w:numPr>
           <w:ilvl w:val="0"/>
           <w:numId w:val="1011"/>
         </w:numPr>
-        <w:pStyle w:val="Compact"/>
-      </w:pPr>
-      <w:r>
-        <w:t xml:space="preserve">Developer Tools (Docker, Jenkins, Git) (85%)</w:t>
-      </w:r>
-    </w:p>
-    <w:p>
-      <w:pPr>
+      </w:pPr>
+      <w:r>
+        <w:t xml:space="preserve">Developer Tools (Docker, Jenkins, Git, GDB, JTAG/SWD) (85%)</w:t>
+      </w:r>
+    </w:p>
+    <w:p>
+      <w:pPr>
+        <w:pStyle w:val="Compact"/>
         <w:numPr>
           <w:ilvl w:val="0"/>
           <w:numId w:val="1011"/>
         </w:numPr>
-        <w:pStyle w:val="Compact"/>
       </w:pPr>
       <w:r>
         <w:t xml:space="preserve">Terminal Workflow (Vim, GNU tools, shell scripting) (85%)</w:t>
@@ -746,11 +846,11 @@
     </w:p>
     <w:p>
       <w:pPr>
+        <w:pStyle w:val="Compact"/>
         <w:numPr>
           <w:ilvl w:val="0"/>
           <w:numId w:val="1011"/>
         </w:numPr>
-        <w:pStyle w:val="Compact"/>
       </w:pPr>
       <w:r>
         <w:t xml:space="preserve">Linux Kernel (Drivers, Config, BSP) (55%)</w:t>
@@ -758,11 +858,11 @@
     </w:p>
     <w:p>
       <w:pPr>
+        <w:pStyle w:val="Compact"/>
         <w:numPr>
           <w:ilvl w:val="0"/>
           <w:numId w:val="1011"/>
         </w:numPr>
-        <w:pStyle w:val="Compact"/>
       </w:pPr>
       <w:r>
         <w:t xml:space="preserve">Python Middleware (DBus, REST, GObject, threading) (35%)</w:t>
@@ -770,35 +870,34 @@
     </w:p>
     <w:p>
       <w:pPr>
+        <w:pStyle w:val="Compact"/>
         <w:numPr>
           <w:ilvl w:val="0"/>
           <w:numId w:val="1011"/>
         </w:numPr>
-        <w:pStyle w:val="Compact"/>
       </w:pPr>
       <w:r>
         <w:t xml:space="preserve">FPGA Development (SW Interface, Reusable Verilog, Automated Builds) (25%)</w:t>
       </w:r>
     </w:p>
+    <w:bookmarkEnd w:id="38"/>
+    <w:bookmarkStart w:id="41" w:name="education"/>
     <w:p>
       <w:pPr>
         <w:pStyle w:val="Heading3"/>
       </w:pPr>
-      <w:bookmarkStart w:id="40" w:name="education"/>
       <w:r>
         <w:t xml:space="preserve">Education</w:t>
       </w:r>
-      <w:bookmarkEnd w:id="40"/>
-    </w:p>
+    </w:p>
+    <w:bookmarkStart w:id="39" w:name="bs-electrical-engineering"/>
     <w:p>
       <w:pPr>
         <w:pStyle w:val="Heading5"/>
       </w:pPr>
-      <w:bookmarkStart w:id="41" w:name="bs-electrical-engineering"/>
       <w:r>
         <w:t xml:space="preserve">BS Electrical Engineering</w:t>
       </w:r>
-      <w:bookmarkEnd w:id="41"/>
     </w:p>
     <w:p>
       <w:pPr>
@@ -808,15 +907,15 @@
         <w:t xml:space="preserve">South Dakota State University (2012 - 2017)</w:t>
       </w:r>
     </w:p>
+    <w:bookmarkEnd w:id="39"/>
+    <w:bookmarkStart w:id="40" w:name="minor-software-engineering"/>
     <w:p>
       <w:pPr>
         <w:pStyle w:val="Heading5"/>
       </w:pPr>
-      <w:bookmarkStart w:id="42" w:name="minor-software-engineering"/>
       <w:r>
         <w:t xml:space="preserve">Minor Software Engineering</w:t>
       </w:r>
-      <w:bookmarkEnd w:id="42"/>
     </w:p>
     <w:p>
       <w:pPr>
@@ -826,105 +925,106 @@
         <w:t xml:space="preserve">South Dakota State University (2012 - 2017)</w:t>
       </w:r>
     </w:p>
+    <w:bookmarkEnd w:id="40"/>
+    <w:bookmarkEnd w:id="41"/>
+    <w:bookmarkStart w:id="42" w:name="lauguages"/>
     <w:p>
       <w:pPr>
         <w:pStyle w:val="Heading3"/>
       </w:pPr>
-      <w:bookmarkStart w:id="43" w:name="lauguages"/>
       <w:r>
         <w:t xml:space="preserve">Lauguages</w:t>
       </w:r>
-      <w:bookmarkEnd w:id="43"/>
-    </w:p>
-    <w:p>
-      <w:pPr>
+    </w:p>
+    <w:p>
+      <w:pPr>
+        <w:pStyle w:val="Compact"/>
         <w:numPr>
           <w:ilvl w:val="0"/>
           <w:numId w:val="1012"/>
         </w:numPr>
-        <w:pStyle w:val="Compact"/>
-      </w:pPr>
-      <w:r>
-        <w:t xml:space="preserve">Bash (~7 years)</w:t>
-      </w:r>
-    </w:p>
-    <w:p>
-      <w:pPr>
+      </w:pPr>
+      <w:r>
+        <w:t xml:space="preserve">Bash (~10 years)</w:t>
+      </w:r>
+    </w:p>
+    <w:p>
+      <w:pPr>
+        <w:pStyle w:val="Compact"/>
         <w:numPr>
           <w:ilvl w:val="0"/>
           <w:numId w:val="1012"/>
         </w:numPr>
-        <w:pStyle w:val="Compact"/>
-      </w:pPr>
-      <w:r>
-        <w:t xml:space="preserve">Python (~5 years)</w:t>
-      </w:r>
-    </w:p>
-    <w:p>
-      <w:pPr>
+      </w:pPr>
+      <w:r>
+        <w:t xml:space="preserve">Python (~8 years)</w:t>
+      </w:r>
+    </w:p>
+    <w:p>
+      <w:pPr>
+        <w:pStyle w:val="Compact"/>
         <w:numPr>
           <w:ilvl w:val="0"/>
           <w:numId w:val="1012"/>
         </w:numPr>
-        <w:pStyle w:val="Compact"/>
-      </w:pPr>
-      <w:r>
-        <w:t xml:space="preserve">Cpp (~6 years)</w:t>
-      </w:r>
-    </w:p>
-    <w:p>
-      <w:pPr>
+      </w:pPr>
+      <w:r>
+        <w:t xml:space="preserve">C++ (~9 years)</w:t>
+      </w:r>
+    </w:p>
+    <w:p>
+      <w:pPr>
+        <w:pStyle w:val="Compact"/>
         <w:numPr>
           <w:ilvl w:val="0"/>
           <w:numId w:val="1012"/>
         </w:numPr>
-        <w:pStyle w:val="Compact"/>
-      </w:pPr>
-      <w:r>
-        <w:t xml:space="preserve">C (~4 year)</w:t>
-      </w:r>
-    </w:p>
-    <w:p>
-      <w:pPr>
+      </w:pPr>
+      <w:r>
+        <w:t xml:space="preserve">C (~7 years)</w:t>
+      </w:r>
+    </w:p>
+    <w:p>
+      <w:pPr>
+        <w:pStyle w:val="Compact"/>
         <w:numPr>
           <w:ilvl w:val="0"/>
           <w:numId w:val="1012"/>
         </w:numPr>
-        <w:pStyle w:val="Compact"/>
-      </w:pPr>
-      <w:r>
-        <w:t xml:space="preserve">Dockerfile (~2 year)</w:t>
-      </w:r>
-    </w:p>
-    <w:p>
-      <w:pPr>
+      </w:pPr>
+      <w:r>
+        <w:t xml:space="preserve">Dockerfile (~5 years)</w:t>
+      </w:r>
+    </w:p>
+    <w:p>
+      <w:pPr>
+        <w:pStyle w:val="Compact"/>
         <w:numPr>
           <w:ilvl w:val="0"/>
           <w:numId w:val="1012"/>
         </w:numPr>
-        <w:pStyle w:val="Compact"/>
       </w:pPr>
       <w:r>
         <w:t xml:space="preserve">Java for Android (~1 year)</w:t>
       </w:r>
     </w:p>
+    <w:bookmarkEnd w:id="42"/>
+    <w:bookmarkStart w:id="43" w:name="interests"/>
     <w:p>
       <w:pPr>
         <w:pStyle w:val="Heading3"/>
       </w:pPr>
-      <w:bookmarkStart w:id="44" w:name="interests"/>
       <w:r>
         <w:t xml:space="preserve">Interests</w:t>
       </w:r>
-      <w:bookmarkEnd w:id="44"/>
-    </w:p>
-    <w:p>
-      <w:pPr>
+    </w:p>
+    <w:p>
+      <w:pPr>
+        <w:pStyle w:val="Compact"/>
         <w:numPr>
           <w:ilvl w:val="0"/>
           <w:numId w:val="1013"/>
         </w:numPr>
-        <w:pStyle w:val="Compact"/>
       </w:pPr>
       <w:r>
         <w:t xml:space="preserve">hobby-electronics, home automation, embedded-linux</w:t>
@@ -932,11 +1032,11 @@
     </w:p>
     <w:p>
       <w:pPr>
+        <w:pStyle w:val="Compact"/>
         <w:numPr>
           <w:ilvl w:val="0"/>
           <w:numId w:val="1013"/>
         </w:numPr>
-        <w:pStyle w:val="Compact"/>
       </w:pPr>
       <w:r>
         <w:t xml:space="preserve">ice and rock climbing</w:t>
@@ -944,11 +1044,11 @@
     </w:p>
     <w:p>
       <w:pPr>
+        <w:pStyle w:val="Compact"/>
         <w:numPr>
           <w:ilvl w:val="0"/>
           <w:numId w:val="1013"/>
         </w:numPr>
-        <w:pStyle w:val="Compact"/>
       </w:pPr>
       <w:r>
         <w:t xml:space="preserve">snowboarding and skiing</w:t>
@@ -956,11 +1056,11 @@
     </w:p>
     <w:p>
       <w:pPr>
+        <w:pStyle w:val="Compact"/>
         <w:numPr>
           <w:ilvl w:val="0"/>
           <w:numId w:val="1013"/>
         </w:numPr>
-        <w:pStyle w:val="Compact"/>
       </w:pPr>
       <w:r>
         <w:t xml:space="preserve">gardening, cooking</w:t>
@@ -968,11 +1068,11 @@
     </w:p>
     <w:p>
       <w:pPr>
+        <w:pStyle w:val="Compact"/>
         <w:numPr>
           <w:ilvl w:val="0"/>
           <w:numId w:val="1013"/>
         </w:numPr>
-        <w:pStyle w:val="Compact"/>
       </w:pPr>
       <w:r>
         <w:t xml:space="preserve">jetsking, boating, water skiing</w:t>
@@ -980,16 +1080,18 @@
     </w:p>
     <w:p>
       <w:pPr>
+        <w:pStyle w:val="Compact"/>
         <w:numPr>
           <w:ilvl w:val="0"/>
           <w:numId w:val="1013"/>
         </w:numPr>
-        <w:pStyle w:val="Compact"/>
       </w:pPr>
       <w:r>
         <w:t xml:space="preserve">camping, kayaking, volleyball</w:t>
       </w:r>
     </w:p>
+    <w:bookmarkEnd w:id="43"/>
+    <w:bookmarkEnd w:id="44"/>
     <w:sectPr/>
   </w:body>
 </w:document>
@@ -1021,17 +1123,14 @@
 <file path=word/numbering.xml><?xml version="1.0" encoding="utf-8"?>
 <w:numbering xmlns:w="http://schemas.openxmlformats.org/wordprocessingml/2006/main">
   <w:abstractNum w:abstractNumId="990">
-    <w:nsid w:val="2c1ae401"/>
+    <w:nsid w:val="0000A990"/>
     <w:multiLevelType w:val="multilevel"/>
     <w:lvl w:ilvl="0">
       <w:numFmt w:val="bullet"/>
       <w:lvlText w:val=" "/>
       <w:lvlJc w:val="left"/>
       <w:pPr>
-        <w:tabs>
-          <w:tab w:val="num" w:pos="0"/>
-        </w:tabs>
-        <w:ind w:left="480" w:hanging="480"/>
+        <w:ind w:left="720" w:hanging="480"/>
       </w:pPr>
     </w:lvl>
     <w:lvl w:ilvl="1">
@@ -1039,10 +1138,7 @@
       <w:lvlText w:val=" "/>
       <w:lvlJc w:val="left"/>
       <w:pPr>
-        <w:tabs>
-          <w:tab w:val="num" w:pos="720"/>
-        </w:tabs>
-        <w:ind w:left="1200" w:hanging="480"/>
+        <w:ind w:left="1440" w:hanging="480"/>
       </w:pPr>
     </w:lvl>
     <w:lvl w:ilvl="2">
@@ -1050,10 +1146,7 @@
       <w:lvlText w:val=" "/>
       <w:lvlJc w:val="left"/>
       <w:pPr>
-        <w:tabs>
-          <w:tab w:val="num" w:pos="1440"/>
-        </w:tabs>
-        <w:ind w:left="1920" w:hanging="480"/>
+        <w:ind w:left="2160" w:hanging="480"/>
       </w:pPr>
     </w:lvl>
     <w:lvl w:ilvl="3">
@@ -1061,10 +1154,7 @@
       <w:lvlText w:val=" "/>
       <w:lvlJc w:val="left"/>
       <w:pPr>
-        <w:tabs>
-          <w:tab w:val="num" w:pos="2160"/>
-        </w:tabs>
-        <w:ind w:left="2640" w:hanging="480"/>
+        <w:ind w:left="2880" w:hanging="480"/>
       </w:pPr>
     </w:lvl>
     <w:lvl w:ilvl="4">
@@ -1072,10 +1162,7 @@
       <w:lvlText w:val=" "/>
       <w:lvlJc w:val="left"/>
       <w:pPr>
-        <w:tabs>
-          <w:tab w:val="num" w:pos="2880"/>
-        </w:tabs>
-        <w:ind w:left="3360" w:hanging="480"/>
+        <w:ind w:left="3600" w:hanging="480"/>
       </w:pPr>
     </w:lvl>
     <w:lvl w:ilvl="5">
@@ -1083,10 +1170,7 @@
       <w:lvlText w:val=" "/>
       <w:lvlJc w:val="left"/>
       <w:pPr>
-        <w:tabs>
-          <w:tab w:val="num" w:pos="3600"/>
-        </w:tabs>
-        <w:ind w:left="4080" w:hanging="480"/>
+        <w:ind w:left="4320" w:hanging="480"/>
       </w:pPr>
     </w:lvl>
     <w:lvl w:ilvl="6">
@@ -1094,10 +1178,7 @@
       <w:lvlText w:val=" "/>
       <w:lvlJc w:val="left"/>
       <w:pPr>
-        <w:tabs>
-          <w:tab w:val="num" w:pos="4320"/>
-        </w:tabs>
-        <w:ind w:left="4800" w:hanging="480"/>
+        <w:ind w:left="5040" w:hanging="480"/>
       </w:pPr>
     </w:lvl>
     <w:lvl w:ilvl="7">
@@ -1105,10 +1186,7 @@
       <w:lvlText w:val=" "/>
       <w:lvlJc w:val="left"/>
       <w:pPr>
-        <w:tabs>
-          <w:tab w:val="num" w:pos="5040"/>
-        </w:tabs>
-        <w:ind w:left="5520" w:hanging="480"/>
+        <w:ind w:left="5760" w:hanging="480"/>
       </w:pPr>
     </w:lvl>
     <w:lvl w:ilvl="8">
@@ -1116,25 +1194,19 @@
       <w:lvlText w:val=" "/>
       <w:lvlJc w:val="left"/>
       <w:pPr>
-        <w:tabs>
-          <w:tab w:val="num" w:pos="5760"/>
-        </w:tabs>
-        <w:ind w:left="6240" w:hanging="480"/>
+        <w:ind w:left="6480" w:hanging="480"/>
       </w:pPr>
     </w:lvl>
   </w:abstractNum>
   <w:abstractNum w:abstractNumId="991">
-    <w:nsid w:val="ea454b4c"/>
+    <w:nsid w:val="0000A991"/>
     <w:multiLevelType w:val="multilevel"/>
     <w:lvl w:ilvl="0">
       <w:numFmt w:val="bullet"/>
       <w:lvlText w:val="•"/>
       <w:lvlJc w:val="left"/>
       <w:pPr>
-        <w:tabs>
-          <w:tab w:val="num" w:pos="0"/>
-        </w:tabs>
-        <w:ind w:left="480" w:hanging="480"/>
+        <w:ind w:left="720" w:hanging="480"/>
       </w:pPr>
     </w:lvl>
     <w:lvl w:ilvl="1">
@@ -1142,10 +1214,7 @@
       <w:lvlText w:val="–"/>
       <w:lvlJc w:val="left"/>
       <w:pPr>
-        <w:tabs>
-          <w:tab w:val="num" w:pos="720"/>
-        </w:tabs>
-        <w:ind w:left="1200" w:hanging="480"/>
+        <w:ind w:left="1440" w:hanging="480"/>
       </w:pPr>
     </w:lvl>
     <w:lvl w:ilvl="2">
@@ -1153,10 +1222,7 @@
       <w:lvlText w:val="•"/>
       <w:lvlJc w:val="left"/>
       <w:pPr>
-        <w:tabs>
-          <w:tab w:val="num" w:pos="1440"/>
-        </w:tabs>
-        <w:ind w:left="1920" w:hanging="480"/>
+        <w:ind w:left="2160" w:hanging="480"/>
       </w:pPr>
     </w:lvl>
     <w:lvl w:ilvl="3">
@@ -1164,10 +1230,7 @@
       <w:lvlText w:val="–"/>
       <w:lvlJc w:val="left"/>
       <w:pPr>
-        <w:tabs>
-          <w:tab w:val="num" w:pos="2160"/>
-        </w:tabs>
-        <w:ind w:left="2640" w:hanging="480"/>
+        <w:ind w:left="2880" w:hanging="480"/>
       </w:pPr>
     </w:lvl>
     <w:lvl w:ilvl="4">
@@ -1175,10 +1238,7 @@
       <w:lvlText w:val="•"/>
       <w:lvlJc w:val="left"/>
       <w:pPr>
-        <w:tabs>
-          <w:tab w:val="num" w:pos="2880"/>
-        </w:tabs>
-        <w:ind w:left="3360" w:hanging="480"/>
+        <w:ind w:left="3600" w:hanging="480"/>
       </w:pPr>
     </w:lvl>
     <w:lvl w:ilvl="5">
@@ -1186,10 +1246,7 @@
       <w:lvlText w:val="–"/>
       <w:lvlJc w:val="left"/>
       <w:pPr>
-        <w:tabs>
-          <w:tab w:val="num" w:pos="3600"/>
-        </w:tabs>
-        <w:ind w:left="4080" w:hanging="480"/>
+        <w:ind w:left="4320" w:hanging="480"/>
       </w:pPr>
     </w:lvl>
     <w:lvl w:ilvl="6">
@@ -1197,10 +1254,7 @@
       <w:lvlText w:val="•"/>
       <w:lvlJc w:val="left"/>
       <w:pPr>
-        <w:tabs>
-          <w:tab w:val="num" w:pos="4320"/>
-        </w:tabs>
-        <w:ind w:left="4800" w:hanging="480"/>
+        <w:ind w:left="5040" w:hanging="480"/>
       </w:pPr>
     </w:lvl>
     <w:lvl w:ilvl="7">
@@ -1208,10 +1262,7 @@
       <w:lvlText w:val="–"/>
       <w:lvlJc w:val="left"/>
       <w:pPr>
-        <w:tabs>
-          <w:tab w:val="num" w:pos="5040"/>
-        </w:tabs>
-        <w:ind w:left="5520" w:hanging="480"/>
+        <w:ind w:left="5760" w:hanging="480"/>
       </w:pPr>
     </w:lvl>
     <w:lvl w:ilvl="8">
@@ -1219,10 +1270,7 @@
       <w:lvlText w:val="•"/>
       <w:lvlJc w:val="left"/>
       <w:pPr>
-        <w:tabs>
-          <w:tab w:val="num" w:pos="5760"/>
-        </w:tabs>
-        <w:ind w:left="6240" w:hanging="480"/>
+        <w:ind w:left="6480" w:hanging="480"/>
       </w:pPr>
     </w:lvl>
   </w:abstractNum>
@@ -1276,10 +1324,10 @@
   <w:docDefaults>
     <w:rPrDefault>
       <w:rPr>
-        <w:rFonts w:asciiTheme="minorHAnsi" w:eastAsiaTheme="minorHAnsi" w:hAnsiTheme="minorHAnsi" w:cstheme="minorBidi"/>
+        <w:rFonts w:asciiTheme="minorHAnsi" w:cstheme="minorBidi" w:eastAsiaTheme="minorHAnsi" w:hAnsiTheme="minorHAnsi"/>
         <w:sz w:val="24"/>
         <w:szCs w:val="24"/>
-        <w:lang w:val="en-US" w:eastAsia="en-US" w:bidi="ar-SA"/>
+        <w:lang w:bidi="ar-SA" w:eastAsia="en-US" w:val="en-US"/>
       </w:rPr>
     </w:rPrDefault>
     <w:pPrDefault>
@@ -1288,35 +1336,35 @@
       </w:pPr>
     </w:pPrDefault>
   </w:docDefaults>
-  <w:latentStyles w:defLockedState="0" w:defUIPriority="0" w:defSemiHidden="0" w:defUnhideWhenUsed="0" w:defQFormat="0" w:count="276"/>
-  <w:style w:type="paragraph" w:default="1" w:styleId="Normal">
+  <w:latentStyles w:count="276" w:defLockedState="0" w:defQFormat="0" w:defSemiHidden="0" w:defUIPriority="0" w:defUnhideWhenUsed="0"/>
+  <w:style w:default="1" w:styleId="Normal" w:type="paragraph">
     <w:name w:val="Normal"/>
     <w:qFormat/>
   </w:style>
-  <w:style w:type="paragraph" w:styleId="BodyText">
+  <w:style w:styleId="BodyText" w:type="paragraph">
     <w:name w:val="Body Text"/>
     <w:basedOn w:val="Normal"/>
     <w:link w:val="BodyTextChar"/>
-    <w:pPr>
-      <w:spacing w:before="180" w:after="180"/>
-    </w:pPr>
-    <w:qFormat/>
-  </w:style>
-  <w:style w:type="paragraph" w:customStyle="1" w:styleId="FirstParagraph">
+    <w:qFormat/>
+    <w:pPr>
+      <w:spacing w:after="180" w:before="180"/>
+    </w:pPr>
+  </w:style>
+  <w:style w:customStyle="1" w:styleId="FirstParagraph" w:type="paragraph">
     <w:name w:val="First Paragraph"/>
     <w:basedOn w:val="BodyText"/>
     <w:next w:val="BodyText"/>
     <w:qFormat/>
   </w:style>
-  <w:style w:type="paragraph" w:customStyle="1" w:styleId="Compact">
+  <w:style w:customStyle="1" w:styleId="Compact" w:type="paragraph">
     <w:name w:val="Compact"/>
     <w:basedOn w:val="BodyText"/>
     <w:qFormat/>
     <w:pPr>
-      <w:spacing w:before="36" w:after="36"/>
-    </w:pPr>
-  </w:style>
-  <w:style w:type="paragraph" w:styleId="Title">
+      <w:spacing w:after="36" w:before="36"/>
+    </w:pPr>
+  </w:style>
+  <w:style w:styleId="Title" w:type="paragraph">
     <w:name w:val="Title"/>
     <w:basedOn w:val="Normal"/>
     <w:next w:val="BodyText"/>
@@ -1324,19 +1372,19 @@
     <w:pPr>
       <w:keepNext/>
       <w:keepLines/>
-      <w:spacing w:before="480" w:after="240"/>
+      <w:spacing w:after="240" w:before="480"/>
       <w:jc w:val="center"/>
     </w:pPr>
     <w:rPr>
-      <w:rFonts w:asciiTheme="majorHAnsi" w:eastAsiaTheme="majorEastAsia" w:hAnsiTheme="majorHAnsi" w:cstheme="majorBidi"/>
+      <w:rFonts w:asciiTheme="majorHAnsi" w:cstheme="majorBidi" w:eastAsiaTheme="majorEastAsia" w:hAnsiTheme="majorHAnsi"/>
       <w:b/>
       <w:bCs/>
-      <w:color w:val="345A8A" w:themeColor="accent1" w:themeShade="B5"/>
+      <w:color w:themeColor="accent1" w:themeShade="B5" w:val="345A8A"/>
       <w:sz w:val="36"/>
       <w:szCs w:val="36"/>
     </w:rPr>
   </w:style>
-  <w:style w:type="paragraph" w:styleId="Subtitle">
+  <w:style w:styleId="Subtitle" w:type="paragraph">
     <w:name w:val="Subtitle"/>
     <w:basedOn w:val="Title"/>
     <w:next w:val="BodyText"/>
@@ -1344,7 +1392,7 @@
     <w:pPr>
       <w:keepNext/>
       <w:keepLines/>
-      <w:spacing w:before="240" w:after="240"/>
+      <w:spacing w:after="240" w:before="240"/>
       <w:jc w:val="center"/>
     </w:pPr>
     <w:rPr>
@@ -1352,7 +1400,7 @@
       <w:szCs w:val="30"/>
     </w:rPr>
   </w:style>
-  <w:style w:type="paragraph" w:customStyle="1" w:styleId="Author">
+  <w:style w:customStyle="1" w:styleId="Author" w:type="paragraph">
     <w:name w:val="Author"/>
     <w:next w:val="BodyText"/>
     <w:qFormat/>
@@ -1362,7 +1410,7 @@
       <w:jc w:val="center"/>
     </w:pPr>
   </w:style>
-  <w:style w:type="paragraph" w:styleId="Date">
+  <w:style w:styleId="Date" w:type="paragraph">
     <w:name w:val="Date"/>
     <w:next w:val="BodyText"/>
     <w:qFormat/>
@@ -1372,7 +1420,25 @@
       <w:jc w:val="center"/>
     </w:pPr>
   </w:style>
-  <w:style w:type="paragraph" w:customStyle="1" w:styleId="Abstract">
+  <w:style w:customStyle="1" w:styleId="AbstractTitle" w:type="paragraph">
+    <w:name w:val="Abstract Title"/>
+    <w:basedOn w:val="Normal"/>
+    <w:next w:val="Abstract"/>
+    <w:qFormat/>
+    <w:pPr>
+      <w:keepNext/>
+      <w:keepLines/>
+      <w:spacing w:after="0" w:before="300"/>
+      <w:jc w:val="center"/>
+    </w:pPr>
+    <w:rPr>
+      <w:b/>
+      <w:color w:val="345A8A"/>
+      <w:sz w:val="20"/>
+      <w:szCs w:val="20"/>
+    </w:rPr>
+  </w:style>
+  <w:style w:customStyle="1" w:styleId="Abstract" w:type="paragraph">
     <w:name w:val="Abstract"/>
     <w:basedOn w:val="Normal"/>
     <w:next w:val="BodyText"/>
@@ -1380,14 +1446,14 @@
     <w:pPr>
       <w:keepNext/>
       <w:keepLines/>
-      <w:spacing w:before="300" w:after="300"/>
+      <w:spacing w:after="300" w:before="100"/>
     </w:pPr>
     <w:rPr>
       <w:sz w:val="20"/>
       <w:szCs w:val="20"/>
     </w:rPr>
   </w:style>
-  <w:style w:type="paragraph" w:styleId="Bibliography">
+  <w:style w:styleId="Bibliography" w:type="paragraph">
     <w:name w:val="Bibliography"/>
     <w:basedOn w:val="Normal"/>
     <w:next w:val="Bibliography"/>
@@ -1395,7 +1461,7 @@
     <w:pPr/>
     <w:rPr/>
   </w:style>
-  <w:style w:type="paragraph" w:styleId="Heading1">
+  <w:style w:styleId="Heading1" w:type="paragraph">
     <w:name w:val="Heading 1"/>
     <w:basedOn w:val="Normal"/>
     <w:next w:val="BodyText"/>
@@ -1404,19 +1470,19 @@
     <w:pPr>
       <w:keepNext/>
       <w:keepLines/>
-      <w:spacing w:before="480" w:after="0"/>
+      <w:spacing w:after="0" w:before="480"/>
       <w:outlineLvl w:val="0"/>
     </w:pPr>
     <w:rPr>
-      <w:rFonts w:asciiTheme="majorHAnsi" w:eastAsiaTheme="majorEastAsia" w:hAnsiTheme="majorHAnsi" w:cstheme="majorBidi"/>
+      <w:rFonts w:asciiTheme="majorHAnsi" w:cstheme="majorBidi" w:eastAsiaTheme="majorEastAsia" w:hAnsiTheme="majorHAnsi"/>
       <w:b/>
       <w:bCs/>
-      <w:color w:val="4F81BD" w:themeColor="accent1"/>
+      <w:color w:themeColor="accent1" w:val="4F81BD"/>
       <w:sz w:val="32"/>
       <w:szCs w:val="32"/>
     </w:rPr>
   </w:style>
-  <w:style w:type="paragraph" w:styleId="Heading2">
+  <w:style w:styleId="Heading2" w:type="paragraph">
     <w:name w:val="Heading 2"/>
     <w:basedOn w:val="Normal"/>
     <w:next w:val="BodyText"/>
@@ -1426,19 +1492,19 @@
     <w:pPr>
       <w:keepNext/>
       <w:keepLines/>
-      <w:spacing w:before="200" w:after="0"/>
+      <w:spacing w:after="0" w:before="200"/>
       <w:outlineLvl w:val="1"/>
     </w:pPr>
     <w:rPr>
-      <w:rFonts w:asciiTheme="majorHAnsi" w:eastAsiaTheme="majorEastAsia" w:hAnsiTheme="majorHAnsi" w:cstheme="majorBidi"/>
+      <w:rFonts w:asciiTheme="majorHAnsi" w:cstheme="majorBidi" w:eastAsiaTheme="majorEastAsia" w:hAnsiTheme="majorHAnsi"/>
       <w:b/>
       <w:bCs/>
-      <w:color w:val="4F81BD" w:themeColor="accent1"/>
+      <w:color w:themeColor="accent1" w:val="4F81BD"/>
       <w:sz w:val="28"/>
       <w:szCs w:val="28"/>
     </w:rPr>
   </w:style>
-  <w:style w:type="paragraph" w:styleId="Heading3">
+  <w:style w:styleId="Heading3" w:type="paragraph">
     <w:name w:val="Heading 3"/>
     <w:basedOn w:val="Normal"/>
     <w:next w:val="BodyText"/>
@@ -1448,19 +1514,19 @@
     <w:pPr>
       <w:keepNext/>
       <w:keepLines/>
-      <w:spacing w:before="200" w:after="0"/>
+      <w:spacing w:after="0" w:before="200"/>
       <w:outlineLvl w:val="2"/>
     </w:pPr>
     <w:rPr>
-      <w:rFonts w:asciiTheme="majorHAnsi" w:eastAsiaTheme="majorEastAsia" w:hAnsiTheme="majorHAnsi" w:cstheme="majorBidi"/>
+      <w:rFonts w:asciiTheme="majorHAnsi" w:cstheme="majorBidi" w:eastAsiaTheme="majorEastAsia" w:hAnsiTheme="majorHAnsi"/>
       <w:b/>
       <w:bCs/>
-      <w:color w:val="4F81BD" w:themeColor="accent1"/>
+      <w:color w:themeColor="accent1" w:val="4F81BD"/>
       <w:sz w:val="24"/>
       <w:szCs w:val="24"/>
     </w:rPr>
   </w:style>
-  <w:style w:type="paragraph" w:styleId="Heading4">
+  <w:style w:styleId="Heading4" w:type="paragraph">
     <w:name w:val="Heading 4"/>
     <w:basedOn w:val="Normal"/>
     <w:next w:val="BodyText"/>
@@ -1470,19 +1536,19 @@
     <w:pPr>
       <w:keepNext/>
       <w:keepLines/>
-      <w:spacing w:before="200" w:after="0"/>
+      <w:spacing w:after="0" w:before="200"/>
       <w:outlineLvl w:val="3"/>
     </w:pPr>
     <w:rPr>
-      <w:rFonts w:asciiTheme="majorHAnsi" w:eastAsiaTheme="majorEastAsia" w:hAnsiTheme="majorHAnsi" w:cstheme="majorBidi"/>
+      <w:rFonts w:asciiTheme="majorHAnsi" w:cstheme="majorBidi" w:eastAsiaTheme="majorEastAsia" w:hAnsiTheme="majorHAnsi"/>
+      <w:bCs/>
       <w:i/>
-      <w:bCs/>
-      <w:color w:val="4F81BD" w:themeColor="accent1"/>
+      <w:color w:themeColor="accent1" w:val="4F81BD"/>
       <w:sz w:val="24"/>
       <w:szCs w:val="24"/>
     </w:rPr>
   </w:style>
-  <w:style w:type="paragraph" w:styleId="Heading5">
+  <w:style w:styleId="Heading5" w:type="paragraph">
     <w:name w:val="Heading 5"/>
     <w:basedOn w:val="Normal"/>
     <w:next w:val="BodyText"/>
@@ -1492,18 +1558,18 @@
     <w:pPr>
       <w:keepNext/>
       <w:keepLines/>
-      <w:spacing w:before="200" w:after="0"/>
+      <w:spacing w:after="0" w:before="200"/>
       <w:outlineLvl w:val="4"/>
     </w:pPr>
     <w:rPr>
-      <w:rFonts w:asciiTheme="majorHAnsi" w:eastAsiaTheme="majorEastAsia" w:hAnsiTheme="majorHAnsi" w:cstheme="majorBidi"/>
+      <w:rFonts w:asciiTheme="majorHAnsi" w:cstheme="majorBidi" w:eastAsiaTheme="majorEastAsia" w:hAnsiTheme="majorHAnsi"/>
       <w:iCs/>
-      <w:color w:val="4F81BD" w:themeColor="accent1"/>
+      <w:color w:themeColor="accent1" w:val="4F81BD"/>
       <w:sz w:val="24"/>
       <w:szCs w:val="24"/>
     </w:rPr>
   </w:style>
-  <w:style w:type="paragraph" w:styleId="Heading6">
+  <w:style w:styleId="Heading6" w:type="paragraph">
     <w:name w:val="Heading 6"/>
     <w:basedOn w:val="Normal"/>
     <w:next w:val="BodyText"/>
@@ -1513,17 +1579,17 @@
     <w:pPr>
       <w:keepNext/>
       <w:keepLines/>
-      <w:spacing w:before="200" w:after="0"/>
+      <w:spacing w:after="0" w:before="200"/>
       <w:outlineLvl w:val="5"/>
     </w:pPr>
     <w:rPr>
-      <w:rFonts w:asciiTheme="majorHAnsi" w:eastAsiaTheme="majorEastAsia" w:hAnsiTheme="majorHAnsi" w:cstheme="majorBidi"/>
-      <w:color w:val="4F81BD" w:themeColor="accent1"/>
+      <w:rFonts w:asciiTheme="majorHAnsi" w:cstheme="majorBidi" w:eastAsiaTheme="majorEastAsia" w:hAnsiTheme="majorHAnsi"/>
+      <w:color w:themeColor="accent1" w:val="4F81BD"/>
       <w:sz w:val="24"/>
       <w:szCs w:val="24"/>
     </w:rPr>
   </w:style>
-  <w:style w:type="paragraph" w:styleId="Heading7">
+  <w:style w:styleId="Heading7" w:type="paragraph">
     <w:name w:val="Heading 7"/>
     <w:basedOn w:val="Normal"/>
     <w:next w:val="BodyText"/>
@@ -1533,17 +1599,17 @@
     <w:pPr>
       <w:keepNext/>
       <w:keepLines/>
-      <w:spacing w:before="200" w:after="0"/>
+      <w:spacing w:after="0" w:before="200"/>
       <w:outlineLvl w:val="6"/>
     </w:pPr>
     <w:rPr>
-      <w:rFonts w:asciiTheme="majorHAnsi" w:eastAsiaTheme="majorEastAsia" w:hAnsiTheme="majorHAnsi" w:cstheme="majorBidi"/>
-      <w:color w:val="4F81BD" w:themeColor="accent1"/>
+      <w:rFonts w:asciiTheme="majorHAnsi" w:cstheme="majorBidi" w:eastAsiaTheme="majorEastAsia" w:hAnsiTheme="majorHAnsi"/>
+      <w:color w:themeColor="accent1" w:val="4F81BD"/>
       <w:sz w:val="24"/>
       <w:szCs w:val="24"/>
     </w:rPr>
   </w:style>
-  <w:style w:type="paragraph" w:styleId="Heading8">
+  <w:style w:styleId="Heading8" w:type="paragraph">
     <w:name w:val="Heading 8"/>
     <w:basedOn w:val="Normal"/>
     <w:next w:val="BodyText"/>
@@ -1553,17 +1619,17 @@
     <w:pPr>
       <w:keepNext/>
       <w:keepLines/>
-      <w:spacing w:before="200" w:after="0"/>
+      <w:spacing w:after="0" w:before="200"/>
       <w:outlineLvl w:val="7"/>
     </w:pPr>
     <w:rPr>
-      <w:rFonts w:asciiTheme="majorHAnsi" w:eastAsiaTheme="majorEastAsia" w:hAnsiTheme="majorHAnsi" w:cstheme="majorBidi"/>
-      <w:color w:val="4F81BD" w:themeColor="accent1"/>
+      <w:rFonts w:asciiTheme="majorHAnsi" w:cstheme="majorBidi" w:eastAsiaTheme="majorEastAsia" w:hAnsiTheme="majorHAnsi"/>
+      <w:color w:themeColor="accent1" w:val="4F81BD"/>
       <w:sz w:val="24"/>
       <w:szCs w:val="24"/>
     </w:rPr>
   </w:style>
-  <w:style w:type="paragraph" w:styleId="Heading9">
+  <w:style w:styleId="Heading9" w:type="paragraph">
     <w:name w:val="Heading 9"/>
     <w:basedOn w:val="Normal"/>
     <w:next w:val="BodyText"/>
@@ -1573,17 +1639,17 @@
     <w:pPr>
       <w:keepNext/>
       <w:keepLines/>
-      <w:spacing w:before="200" w:after="0"/>
+      <w:spacing w:after="0" w:before="200"/>
       <w:outlineLvl w:val="8"/>
     </w:pPr>
     <w:rPr>
-      <w:rFonts w:asciiTheme="majorHAnsi" w:eastAsiaTheme="majorEastAsia" w:hAnsiTheme="majorHAnsi" w:cstheme="majorBidi"/>
-      <w:color w:val="4F81BD" w:themeColor="accent1"/>
+      <w:rFonts w:asciiTheme="majorHAnsi" w:cstheme="majorBidi" w:eastAsiaTheme="majorEastAsia" w:hAnsiTheme="majorHAnsi"/>
+      <w:color w:themeColor="accent1" w:val="4F81BD"/>
       <w:sz w:val="24"/>
       <w:szCs w:val="24"/>
     </w:rPr>
   </w:style>
-  <w:style w:type="paragraph" w:styleId="BlockText">
+  <w:style w:styleId="BlockText" w:type="paragraph">
     <w:name w:val="Block Text"/>
     <w:basedOn w:val="BodyText"/>
     <w:next w:val="BodyText"/>
@@ -1591,11 +1657,11 @@
     <w:unhideWhenUsed/>
     <w:qFormat/>
     <w:pPr>
-      <w:spacing w:before="100" w:after="100"/>
+      <w:spacing w:after="100" w:before="100"/>
       <w:ind w:firstLine="0" w:left="480" w:right="480"/>
     </w:pPr>
   </w:style>
-  <w:style w:type="paragraph" w:styleId="FootnoteText">
+  <w:style w:styleId="FootnoteText" w:type="paragraph">
     <w:name w:val="Footnote Text"/>
     <w:basedOn w:val="Normal"/>
     <w:next w:val="FootnoteText"/>
@@ -1603,28 +1669,55 @@
     <w:unhideWhenUsed/>
     <w:qFormat/>
   </w:style>
-  <w:style w:type="character" w:default="1" w:styleId="DefaultParagraphFont">
+  <w:style w:styleId="FootnoteBlockText" w:type="paragraph">
+    <w:name w:val="Footnote Block Text"/>
+    <w:basedOn w:val="Footnote Text"/>
+    <w:next w:val="Footnote Text"/>
+    <w:uiPriority w:val="9"/>
+    <w:unhideWhenUsed/>
+    <w:qFormat/>
+    <w:pPr>
+      <w:spacing w:after="100" w:before="100"/>
+      <w:ind w:firstLine="0" w:left="480" w:right="480"/>
+    </w:pPr>
+  </w:style>
+  <w:style w:default="1" w:styleId="DefaultParagraphFont" w:type="character">
     <w:name w:val="Default Paragraph Font"/>
     <w:semiHidden/>
     <w:unhideWhenUsed/>
   </w:style>
-  <w:style w:type="table" w:default="1" w:styleId="Table">
+  <w:style w:default="1" w:styleId="Table" w:type="table">
     <w:name w:val="Table"/>
     <w:basedOn w:val="TableNormal"/>
     <w:semiHidden/>
     <w:unhideWhenUsed/>
     <w:qFormat/>
     <w:tblPr>
-      <w:tblInd w:w="0" w:type="dxa"/>
+      <w:tblInd w:type="dxa" w:w="0"/>
       <w:tblCellMar>
-        <w:top w:w="0" w:type="dxa"/>
-        <w:left w:w="108" w:type="dxa"/>
-        <w:bottom w:w="0" w:type="dxa"/>
-        <w:right w:w="108" w:type="dxa"/>
+        <w:top w:type="dxa" w:w="0"/>
+        <w:left w:type="dxa" w:w="108"/>
+        <w:bottom w:type="dxa" w:w="0"/>
+        <w:right w:type="dxa" w:w="108"/>
       </w:tblCellMar>
     </w:tblPr>
-  </w:style>
-  <w:style w:type="paragraph" w:customStyle="1" w:styleId="DefinitionTerm">
+    <w:tblStylePr w:type="firstRow">
+      <w:tblPr>
+        <w:jc w:val="left"/>
+        <w:tblInd w:type="dxa" w:w="0"/>
+      </w:tblPr>
+      <w:trPr>
+        <w:jc w:val="left"/>
+      </w:trPr>
+      <w:tcPr>
+        <w:tcBorders>
+          <w:bottom w:val="single"/>
+        </w:tcBorders>
+        <w:vAlign w:val="bottom"/>
+      </w:tcPr>
+    </w:tblStylePr>
+  </w:style>
+  <w:style w:customStyle="1" w:styleId="DefinitionTerm" w:type="paragraph">
     <w:name w:val="Definition Term"/>
     <w:basedOn w:val="Normal"/>
     <w:next w:val="Definition"/>
@@ -1637,49 +1730,49 @@
       <w:b/>
     </w:rPr>
   </w:style>
-  <w:style w:type="paragraph" w:customStyle="1" w:styleId="Definition">
+  <w:style w:customStyle="1" w:styleId="Definition" w:type="paragraph">
     <w:name w:val="Definition"/>
     <w:basedOn w:val="Normal"/>
   </w:style>
-  <w:style w:type="paragraph" w:styleId="Caption">
+  <w:style w:styleId="Caption" w:type="paragraph">
     <w:name w:val="Caption"/>
     <w:basedOn w:val="Normal"/>
     <w:link w:val="BodyTextChar"/>
     <w:pPr>
-      <w:spacing w:before="0" w:after="120"/>
+      <w:spacing w:after="120" w:before="0"/>
     </w:pPr>
     <w:rPr>
       <w:i/>
     </w:rPr>
   </w:style>
-  <w:style w:type="paragraph" w:customStyle="1" w:styleId="TableCaption">
+  <w:style w:customStyle="1" w:styleId="TableCaption" w:type="paragraph">
     <w:name w:val="Table Caption"/>
     <w:basedOn w:val="Caption"/>
     <w:pPr>
       <w:keepNext/>
     </w:pPr>
   </w:style>
-  <w:style w:type="paragraph" w:customStyle="1" w:styleId="ImageCaption">
+  <w:style w:customStyle="1" w:styleId="ImageCaption" w:type="paragraph">
     <w:name w:val="Image Caption"/>
     <w:basedOn w:val="Caption"/>
   </w:style>
-  <w:style w:type="paragraph" w:customStyle="1" w:styleId="Figure">
+  <w:style w:customStyle="1" w:styleId="Figure" w:type="paragraph">
     <w:name w:val="Figure"/>
     <w:basedOn w:val="Normal"/>
   </w:style>
-  <w:style w:type="paragraph" w:customStyle="1" w:styleId="CaptionedFigure">
+  <w:style w:customStyle="1" w:styleId="CaptionedFigure" w:type="paragraph">
     <w:name w:val="Captioned Figure"/>
     <w:basedOn w:val="Figure"/>
     <w:pPr>
       <w:keepNext/>
     </w:pPr>
   </w:style>
-  <w:style w:type="character" w:customStyle="1" w:styleId="BodyTextChar">
+  <w:style w:customStyle="1" w:styleId="BodyTextChar" w:type="character">
     <w:name w:val="Body Text Char"/>
     <w:basedOn w:val="DefaultParagraphFont"/>
     <w:link w:val="BodyText"/>
   </w:style>
-  <w:style w:type="character" w:customStyle="1" w:styleId="VerbatimChar">
+  <w:style w:customStyle="1" w:styleId="VerbatimChar" w:type="character">
     <w:name w:val="Verbatim Char"/>
     <w:basedOn w:val="BodyTextChar"/>
     <w:rPr>
@@ -1687,21 +1780,25 @@
       <w:sz w:val="22"/>
     </w:rPr>
   </w:style>
-  <w:style w:type="character" w:styleId="FootnoteReference">
+  <w:style w:customStyle="1" w:styleId="SectionNumber" w:type="character">
+    <w:name w:val="Section Number"/>
+    <w:basedOn w:val="BodyTextChar"/>
+  </w:style>
+  <w:style w:styleId="FootnoteReference" w:type="character">
     <w:name w:val="Footnote Reference"/>
     <w:basedOn w:val="BodyTextChar"/>
     <w:rPr>
       <w:vertAlign w:val="superscript"/>
     </w:rPr>
   </w:style>
-  <w:style w:type="character" w:styleId="Hyperlink">
+  <w:style w:styleId="Hyperlink" w:type="character">
     <w:name w:val="Hyperlink"/>
     <w:basedOn w:val="BodyTextChar"/>
     <w:rPr>
-      <w:color w:val="4F81BD" w:themeColor="accent1"/>
-    </w:rPr>
-  </w:style>
-  <w:style w:type="paragraph" w:styleId="TOCHeading">
+      <w:color w:themeColor="accent1" w:val="4F81BD"/>
+    </w:rPr>
+  </w:style>
+  <w:style w:styleId="TOCHeading" w:type="paragraph">
     <w:name w:val="TOC Heading"/>
     <w:basedOn w:val="Heading1"/>
     <w:next w:val="BodyText"/>
@@ -1713,10 +1810,10 @@
       <w:outlineLvl w:val="9"/>
     </w:pPr>
     <w:rPr>
-      <w:rFonts w:asciiTheme="majorHAnsi" w:eastAsiaTheme="majorEastAsia" w:hAnsiTheme="majorHAnsi" w:cstheme="majorBidi"/>
+      <w:rFonts w:asciiTheme="majorHAnsi" w:cstheme="majorBidi" w:eastAsiaTheme="majorEastAsia" w:hAnsiTheme="majorHAnsi"/>
       <w:b w:val="0"/>
       <w:bCs w:val="0"/>
-      <w:color w:val="365F91" w:themeColor="accent1" w:themeShade="BF"/>
+      <w:color w:themeColor="accent1" w:themeShade="BF" w:val="365F91"/>
     </w:rPr>
   </w:style>
   <w:style w:type="paragraph" w:customStyle="1" w:styleId="SourceCode">
@@ -1731,8 +1828,8 @@
     <w:name w:val="KeywordTok"/>
     <w:basedOn w:val="VerbatimChar"/>
     <w:rPr>
+      <w:b/>
       <w:color w:val="007020"/>
-      <w:b/>
     </w:rPr>
   </w:style>
   <w:style w:type="character" w:customStyle="1" w:styleId="DataTypeTok">
@@ -1808,40 +1905,43 @@
   <w:style w:type="character" w:customStyle="1" w:styleId="ImportTok">
     <w:name w:val="ImportTok"/>
     <w:basedOn w:val="VerbatimChar"/>
-    <w:rPr/>
+    <w:rPr>
+      <w:b/>
+      <w:color w:val="008000"/>
+    </w:rPr>
   </w:style>
   <w:style w:type="character" w:customStyle="1" w:styleId="CommentTok">
     <w:name w:val="CommentTok"/>
     <w:basedOn w:val="VerbatimChar"/>
     <w:rPr>
+      <w:i/>
       <w:color w:val="60a0b0"/>
-      <w:i/>
     </w:rPr>
   </w:style>
   <w:style w:type="character" w:customStyle="1" w:styleId="DocumentationTok">
     <w:name w:val="DocumentationTok"/>
     <w:basedOn w:val="VerbatimChar"/>
     <w:rPr>
+      <w:i/>
       <w:color w:val="ba2121"/>
-      <w:i/>
     </w:rPr>
   </w:style>
   <w:style w:type="character" w:customStyle="1" w:styleId="AnnotationTok">
     <w:name w:val="AnnotationTok"/>
     <w:basedOn w:val="VerbatimChar"/>
     <w:rPr>
-      <w:color w:val="60a0b0"/>
       <w:b/>
       <w:i/>
+      <w:color w:val="60a0b0"/>
     </w:rPr>
   </w:style>
   <w:style w:type="character" w:customStyle="1" w:styleId="CommentVarTok">
     <w:name w:val="CommentVarTok"/>
     <w:basedOn w:val="VerbatimChar"/>
     <w:rPr>
-      <w:color w:val="60a0b0"/>
       <w:b/>
       <w:i/>
+      <w:color w:val="60a0b0"/>
     </w:rPr>
   </w:style>
   <w:style w:type="character" w:customStyle="1" w:styleId="OtherTok">
@@ -1869,8 +1969,8 @@
     <w:name w:val="ControlFlowTok"/>
     <w:basedOn w:val="VerbatimChar"/>
     <w:rPr>
+      <w:b/>
       <w:color w:val="007020"/>
-      <w:b/>
     </w:rPr>
   </w:style>
   <w:style w:type="character" w:customStyle="1" w:styleId="OperatorTok">
@@ -1883,7 +1983,9 @@
   <w:style w:type="character" w:customStyle="1" w:styleId="BuiltInTok">
     <w:name w:val="BuiltInTok"/>
     <w:basedOn w:val="VerbatimChar"/>
-    <w:rPr/>
+    <w:rPr>
+      <w:color w:val="008000"/>
+    </w:rPr>
   </w:style>
   <w:style w:type="character" w:customStyle="1" w:styleId="ExtensionTok">
     <w:name w:val="ExtensionTok"/>
@@ -1913,34 +2015,34 @@
     <w:name w:val="InformationTok"/>
     <w:basedOn w:val="VerbatimChar"/>
     <w:rPr>
-      <w:color w:val="60a0b0"/>
       <w:b/>
       <w:i/>
+      <w:color w:val="60a0b0"/>
     </w:rPr>
   </w:style>
   <w:style w:type="character" w:customStyle="1" w:styleId="WarningTok">
     <w:name w:val="WarningTok"/>
     <w:basedOn w:val="VerbatimChar"/>
     <w:rPr>
-      <w:color w:val="60a0b0"/>
       <w:b/>
       <w:i/>
+      <w:color w:val="60a0b0"/>
     </w:rPr>
   </w:style>
   <w:style w:type="character" w:customStyle="1" w:styleId="AlertTok">
     <w:name w:val="AlertTok"/>
     <w:basedOn w:val="VerbatimChar"/>
     <w:rPr>
+      <w:b/>
       <w:color w:val="ff0000"/>
-      <w:b/>
     </w:rPr>
   </w:style>
   <w:style w:type="character" w:customStyle="1" w:styleId="ErrorTok">
     <w:name w:val="ErrorTok"/>
     <w:basedOn w:val="VerbatimChar"/>
     <w:rPr>
+      <w:b/>
       <w:color w:val="ff0000"/>
-      <w:b/>
     </w:rPr>
   </w:style>
   <w:style w:type="character" w:customStyle="1" w:styleId="NormalTok">

</xml_diff>

<commit_message>
resume: rebuild docx and pdf after OTA scope correction
</commit_message>
<xml_diff>
--- a/static/nathan-genetzky-resume.docx
+++ b/static/nathan-genetzky-resume.docx
@@ -240,7 +240,7 @@
       </w:hyperlink>
     </w:p>
     <w:bookmarkEnd w:id="27"/>
-    <w:bookmarkStart w:id="32" w:name="experiences"/>
+    <w:bookmarkStart w:id="33" w:name="experiences"/>
     <w:p>
       <w:pPr>
         <w:pStyle w:val="Heading2"/>
@@ -347,19 +347,19 @@
         </w:numPr>
       </w:pPr>
       <w:r>
-        <w:t xml:space="preserve">Evaluated RAUC, Mender, and OSTree against product constraints and authored a</w:t>
+        <w:t xml:space="preserve">Implemented RAUC OTA updates across multiple A/B and asymmetric partition</w:t>
       </w:r>
       <w:r>
         <w:t xml:space="preserve"> </w:t>
       </w:r>
       <w:r>
-        <w:t xml:space="preserve">custom update agent where none fit; A/B partitioning, atomic updates, and</w:t>
+        <w:t xml:space="preserve">layouts: U-Boot integration, secure boot fallback handling, recovery from</w:t>
       </w:r>
       <w:r>
         <w:t xml:space="preserve"> </w:t>
       </w:r>
       <w:r>
-        <w:t xml:space="preserve">rollback-safe failure handling.</w:t>
+        <w:t xml:space="preserve">failed kernel, rootfs, and application updates, and the tests to prove it.</w:t>
       </w:r>
     </w:p>
     <w:p>
@@ -371,13 +371,7 @@
         </w:numPr>
       </w:pPr>
       <w:r>
-        <w:t xml:space="preserve">Manage fleets with Balena: device provisioning, remote access, and delivery of</w:t>
-      </w:r>
-      <w:r>
-        <w:t xml:space="preserve"> </w:t>
-      </w:r>
-      <w:r>
-        <w:t xml:space="preserve">containerized applications running on embedded targets.</w:t>
+        <w:t xml:space="preserve">Build and deliver containerized applications that run on embedded targets.</w:t>
       </w:r>
     </w:p>
     <w:p>
@@ -633,8 +627,68 @@
       </w:r>
     </w:p>
     <w:bookmarkEnd w:id="31"/>
+    <w:bookmarkStart w:id="32" w:name="embedded-linux-and-ota-experiments"/>
+    <w:p>
+      <w:pPr>
+        <w:pStyle w:val="Heading4"/>
+      </w:pPr>
+      <w:r>
+        <w:t xml:space="preserve">Embedded Linux and OTA Experiments</w:t>
+      </w:r>
+    </w:p>
+    <w:p>
+      <w:pPr>
+        <w:pStyle w:val="FirstParagraph"/>
+      </w:pPr>
+      <w:r>
+        <w:t xml:space="preserve">Personal projects, self-directed (ONGOING)</w:t>
+      </w:r>
+    </w:p>
+    <w:p>
+      <w:pPr>
+        <w:pStyle w:val="Compact"/>
+        <w:numPr>
+          <w:ilvl w:val="0"/>
+          <w:numId w:val="1007"/>
+        </w:numPr>
+      </w:pPr>
+      <w:r>
+        <w:t xml:space="preserve">Compared Mender and OSTree against RAUC to understand A/B, atomic, and</w:t>
+      </w:r>
+      <w:r>
+        <w:t xml:space="preserve"> </w:t>
+      </w:r>
+      <w:r>
+        <w:t xml:space="preserve">rollback-safe update strategies, and authored a custom update agent to work</w:t>
+      </w:r>
+      <w:r>
+        <w:t xml:space="preserve"> </w:t>
+      </w:r>
+      <w:r>
+        <w:t xml:space="preserve">through the trade-offs first hand.</w:t>
+      </w:r>
+    </w:p>
+    <w:p>
+      <w:pPr>
+        <w:pStyle w:val="Compact"/>
+        <w:numPr>
+          <w:ilvl w:val="0"/>
+          <w:numId w:val="1007"/>
+        </w:numPr>
+      </w:pPr>
+      <w:r>
+        <w:t xml:space="preserve">Managed device fleets with Balena: provisioning, remote access, and delivery</w:t>
+      </w:r>
+      <w:r>
+        <w:t xml:space="preserve"> </w:t>
+      </w:r>
+      <w:r>
+        <w:t xml:space="preserve">of containerized applications to embedded targets.</w:t>
+      </w:r>
+    </w:p>
     <w:bookmarkEnd w:id="32"/>
-    <w:bookmarkStart w:id="44" w:name="projects"/>
+    <w:bookmarkEnd w:id="33"/>
+    <w:bookmarkStart w:id="45" w:name="projects"/>
     <w:p>
       <w:pPr>
         <w:pStyle w:val="Heading2"/>
@@ -643,7 +697,7 @@
         <w:t xml:space="preserve">Projects</w:t>
       </w:r>
     </w:p>
-    <w:bookmarkStart w:id="34" w:name="Xf974c0d12b9b8cbd394ec49fb57f23955fed171"/>
+    <w:bookmarkStart w:id="35" w:name="Xf974c0d12b9b8cbd394ec49fb57f23955fed171"/>
     <w:p>
       <w:pPr>
         <w:pStyle w:val="Heading4"/>
@@ -657,7 +711,7 @@
         <w:pStyle w:val="Compact"/>
         <w:numPr>
           <w:ilvl w:val="0"/>
-          <w:numId w:val="1007"/>
+          <w:numId w:val="1008"/>
         </w:numPr>
       </w:pPr>
       <w:r>
@@ -669,10 +723,10 @@
         <w:pStyle w:val="Compact"/>
         <w:numPr>
           <w:ilvl w:val="0"/>
-          <w:numId w:val="1007"/>
-        </w:numPr>
-      </w:pPr>
-      <w:hyperlink r:id="rId33">
+          <w:numId w:val="1008"/>
+        </w:numPr>
+      </w:pPr>
+      <w:hyperlink r:id="rId34">
         <w:r>
           <w:rPr>
             <w:rStyle w:val="Hyperlink"/>
@@ -681,8 +735,8 @@
         </w:r>
       </w:hyperlink>
     </w:p>
-    <w:bookmarkEnd w:id="34"/>
-    <w:bookmarkStart w:id="35" w:name="X3d3d2f335dee6258fac26945b027a3aa4174c3b"/>
+    <w:bookmarkEnd w:id="35"/>
+    <w:bookmarkStart w:id="36" w:name="X3d3d2f335dee6258fac26945b027a3aa4174c3b"/>
     <w:p>
       <w:pPr>
         <w:pStyle w:val="Heading4"/>
@@ -696,7 +750,7 @@
         <w:pStyle w:val="Compact"/>
         <w:numPr>
           <w:ilvl w:val="0"/>
-          <w:numId w:val="1008"/>
+          <w:numId w:val="1009"/>
         </w:numPr>
       </w:pPr>
       <w:r>
@@ -708,10 +762,10 @@
         <w:pStyle w:val="Compact"/>
         <w:numPr>
           <w:ilvl w:val="0"/>
-          <w:numId w:val="1008"/>
-        </w:numPr>
-      </w:pPr>
-      <w:hyperlink r:id="rId33">
+          <w:numId w:val="1009"/>
+        </w:numPr>
+      </w:pPr>
+      <w:hyperlink r:id="rId34">
         <w:r>
           <w:rPr>
             <w:rStyle w:val="Hyperlink"/>
@@ -720,8 +774,8 @@
         </w:r>
       </w:hyperlink>
     </w:p>
-    <w:bookmarkEnd w:id="35"/>
-    <w:bookmarkStart w:id="36" w:name="X88a4495dfd18e3ff5fd7b652851687dfea54d21"/>
+    <w:bookmarkEnd w:id="36"/>
+    <w:bookmarkStart w:id="37" w:name="X88a4495dfd18e3ff5fd7b652851687dfea54d21"/>
     <w:p>
       <w:pPr>
         <w:pStyle w:val="Heading4"/>
@@ -735,7 +789,7 @@
         <w:pStyle w:val="Compact"/>
         <w:numPr>
           <w:ilvl w:val="0"/>
-          <w:numId w:val="1009"/>
+          <w:numId w:val="1010"/>
         </w:numPr>
       </w:pPr>
       <w:r>
@@ -747,10 +801,10 @@
         <w:pStyle w:val="Compact"/>
         <w:numPr>
           <w:ilvl w:val="0"/>
-          <w:numId w:val="1009"/>
-        </w:numPr>
-      </w:pPr>
-      <w:hyperlink r:id="rId33">
+          <w:numId w:val="1010"/>
+        </w:numPr>
+      </w:pPr>
+      <w:hyperlink r:id="rId34">
         <w:r>
           <w:rPr>
             <w:rStyle w:val="Hyperlink"/>
@@ -759,8 +813,8 @@
         </w:r>
       </w:hyperlink>
     </w:p>
-    <w:bookmarkEnd w:id="36"/>
-    <w:bookmarkStart w:id="37" w:name="particle-projects"/>
+    <w:bookmarkEnd w:id="37"/>
+    <w:bookmarkStart w:id="38" w:name="particle-projects"/>
     <w:p>
       <w:pPr>
         <w:pStyle w:val="Heading4"/>
@@ -774,7 +828,7 @@
         <w:pStyle w:val="Compact"/>
         <w:numPr>
           <w:ilvl w:val="0"/>
-          <w:numId w:val="1010"/>
+          <w:numId w:val="1011"/>
         </w:numPr>
       </w:pPr>
       <w:r>
@@ -786,10 +840,10 @@
         <w:pStyle w:val="Compact"/>
         <w:numPr>
           <w:ilvl w:val="0"/>
-          <w:numId w:val="1010"/>
-        </w:numPr>
-      </w:pPr>
-      <w:hyperlink r:id="rId33">
+          <w:numId w:val="1011"/>
+        </w:numPr>
+      </w:pPr>
+      <w:hyperlink r:id="rId34">
         <w:r>
           <w:rPr>
             <w:rStyle w:val="Hyperlink"/>
@@ -798,8 +852,8 @@
         </w:r>
       </w:hyperlink>
     </w:p>
-    <w:bookmarkEnd w:id="37"/>
-    <w:bookmarkStart w:id="38" w:name="skills-proficiency"/>
+    <w:bookmarkEnd w:id="38"/>
+    <w:bookmarkStart w:id="39" w:name="skills-proficiency"/>
     <w:p>
       <w:pPr>
         <w:pStyle w:val="Heading3"/>
@@ -813,7 +867,7 @@
         <w:pStyle w:val="Compact"/>
         <w:numPr>
           <w:ilvl w:val="0"/>
-          <w:numId w:val="1011"/>
+          <w:numId w:val="1012"/>
         </w:numPr>
       </w:pPr>
       <w:r>
@@ -825,7 +879,7 @@
         <w:pStyle w:val="Compact"/>
         <w:numPr>
           <w:ilvl w:val="0"/>
-          <w:numId w:val="1011"/>
+          <w:numId w:val="1012"/>
         </w:numPr>
       </w:pPr>
       <w:r>
@@ -837,7 +891,7 @@
         <w:pStyle w:val="Compact"/>
         <w:numPr>
           <w:ilvl w:val="0"/>
-          <w:numId w:val="1011"/>
+          <w:numId w:val="1012"/>
         </w:numPr>
       </w:pPr>
       <w:r>
@@ -849,7 +903,7 @@
         <w:pStyle w:val="Compact"/>
         <w:numPr>
           <w:ilvl w:val="0"/>
-          <w:numId w:val="1011"/>
+          <w:numId w:val="1012"/>
         </w:numPr>
       </w:pPr>
       <w:r>
@@ -861,7 +915,7 @@
         <w:pStyle w:val="Compact"/>
         <w:numPr>
           <w:ilvl w:val="0"/>
-          <w:numId w:val="1011"/>
+          <w:numId w:val="1012"/>
         </w:numPr>
       </w:pPr>
       <w:r>
@@ -873,15 +927,15 @@
         <w:pStyle w:val="Compact"/>
         <w:numPr>
           <w:ilvl w:val="0"/>
-          <w:numId w:val="1011"/>
+          <w:numId w:val="1012"/>
         </w:numPr>
       </w:pPr>
       <w:r>
         <w:t xml:space="preserve">FPGA Development (SW Interface, Reusable Verilog, Automated Builds) (25%)</w:t>
       </w:r>
     </w:p>
-    <w:bookmarkEnd w:id="38"/>
-    <w:bookmarkStart w:id="41" w:name="education"/>
+    <w:bookmarkEnd w:id="39"/>
+    <w:bookmarkStart w:id="42" w:name="education"/>
     <w:p>
       <w:pPr>
         <w:pStyle w:val="Heading3"/>
@@ -890,7 +944,7 @@
         <w:t xml:space="preserve">Education</w:t>
       </w:r>
     </w:p>
-    <w:bookmarkStart w:id="39" w:name="bs-electrical-engineering"/>
+    <w:bookmarkStart w:id="40" w:name="bs-electrical-engineering"/>
     <w:p>
       <w:pPr>
         <w:pStyle w:val="Heading5"/>
@@ -907,8 +961,8 @@
         <w:t xml:space="preserve">South Dakota State University (2012 - 2017)</w:t>
       </w:r>
     </w:p>
-    <w:bookmarkEnd w:id="39"/>
-    <w:bookmarkStart w:id="40" w:name="minor-software-engineering"/>
+    <w:bookmarkEnd w:id="40"/>
+    <w:bookmarkStart w:id="41" w:name="minor-software-engineering"/>
     <w:p>
       <w:pPr>
         <w:pStyle w:val="Heading5"/>
@@ -925,9 +979,9 @@
         <w:t xml:space="preserve">South Dakota State University (2012 - 2017)</w:t>
       </w:r>
     </w:p>
-    <w:bookmarkEnd w:id="40"/>
     <w:bookmarkEnd w:id="41"/>
-    <w:bookmarkStart w:id="42" w:name="lauguages"/>
+    <w:bookmarkEnd w:id="42"/>
+    <w:bookmarkStart w:id="43" w:name="lauguages"/>
     <w:p>
       <w:pPr>
         <w:pStyle w:val="Heading3"/>
@@ -941,7 +995,7 @@
         <w:pStyle w:val="Compact"/>
         <w:numPr>
           <w:ilvl w:val="0"/>
-          <w:numId w:val="1012"/>
+          <w:numId w:val="1013"/>
         </w:numPr>
       </w:pPr>
       <w:r>
@@ -953,7 +1007,7 @@
         <w:pStyle w:val="Compact"/>
         <w:numPr>
           <w:ilvl w:val="0"/>
-          <w:numId w:val="1012"/>
+          <w:numId w:val="1013"/>
         </w:numPr>
       </w:pPr>
       <w:r>
@@ -965,7 +1019,7 @@
         <w:pStyle w:val="Compact"/>
         <w:numPr>
           <w:ilvl w:val="0"/>
-          <w:numId w:val="1012"/>
+          <w:numId w:val="1013"/>
         </w:numPr>
       </w:pPr>
       <w:r>
@@ -977,7 +1031,7 @@
         <w:pStyle w:val="Compact"/>
         <w:numPr>
           <w:ilvl w:val="0"/>
-          <w:numId w:val="1012"/>
+          <w:numId w:val="1013"/>
         </w:numPr>
       </w:pPr>
       <w:r>
@@ -989,7 +1043,7 @@
         <w:pStyle w:val="Compact"/>
         <w:numPr>
           <w:ilvl w:val="0"/>
-          <w:numId w:val="1012"/>
+          <w:numId w:val="1013"/>
         </w:numPr>
       </w:pPr>
       <w:r>
@@ -1001,15 +1055,15 @@
         <w:pStyle w:val="Compact"/>
         <w:numPr>
           <w:ilvl w:val="0"/>
-          <w:numId w:val="1012"/>
+          <w:numId w:val="1013"/>
         </w:numPr>
       </w:pPr>
       <w:r>
         <w:t xml:space="preserve">Java for Android (~1 year)</w:t>
       </w:r>
     </w:p>
-    <w:bookmarkEnd w:id="42"/>
-    <w:bookmarkStart w:id="43" w:name="interests"/>
+    <w:bookmarkEnd w:id="43"/>
+    <w:bookmarkStart w:id="44" w:name="interests"/>
     <w:p>
       <w:pPr>
         <w:pStyle w:val="Heading3"/>
@@ -1023,7 +1077,7 @@
         <w:pStyle w:val="Compact"/>
         <w:numPr>
           <w:ilvl w:val="0"/>
-          <w:numId w:val="1013"/>
+          <w:numId w:val="1014"/>
         </w:numPr>
       </w:pPr>
       <w:r>
@@ -1035,7 +1089,7 @@
         <w:pStyle w:val="Compact"/>
         <w:numPr>
           <w:ilvl w:val="0"/>
-          <w:numId w:val="1013"/>
+          <w:numId w:val="1014"/>
         </w:numPr>
       </w:pPr>
       <w:r>
@@ -1047,7 +1101,7 @@
         <w:pStyle w:val="Compact"/>
         <w:numPr>
           <w:ilvl w:val="0"/>
-          <w:numId w:val="1013"/>
+          <w:numId w:val="1014"/>
         </w:numPr>
       </w:pPr>
       <w:r>
@@ -1059,7 +1113,7 @@
         <w:pStyle w:val="Compact"/>
         <w:numPr>
           <w:ilvl w:val="0"/>
-          <w:numId w:val="1013"/>
+          <w:numId w:val="1014"/>
         </w:numPr>
       </w:pPr>
       <w:r>
@@ -1071,7 +1125,7 @@
         <w:pStyle w:val="Compact"/>
         <w:numPr>
           <w:ilvl w:val="0"/>
-          <w:numId w:val="1013"/>
+          <w:numId w:val="1014"/>
         </w:numPr>
       </w:pPr>
       <w:r>
@@ -1083,15 +1137,15 @@
         <w:pStyle w:val="Compact"/>
         <w:numPr>
           <w:ilvl w:val="0"/>
-          <w:numId w:val="1013"/>
+          <w:numId w:val="1014"/>
         </w:numPr>
       </w:pPr>
       <w:r>
         <w:t xml:space="preserve">camping, kayaking, volleyball</w:t>
       </w:r>
     </w:p>
-    <w:bookmarkEnd w:id="43"/>
     <w:bookmarkEnd w:id="44"/>
+    <w:bookmarkEnd w:id="45"/>
     <w:sectPr/>
   </w:body>
 </w:document>
@@ -1314,6 +1368,9 @@
     <w:abstractNumId w:val="991"/>
   </w:num>
   <w:num w:numId="1013">
+    <w:abstractNumId w:val="991"/>
+  </w:num>
+  <w:num w:numId="1014">
     <w:abstractNumId w:val="991"/>
   </w:num>
 </w:numbering>

</xml_diff>

<commit_message>
resume: rebuild docx and pdf with the tightened layout
</commit_message>
<xml_diff>
--- a/static/nathan-genetzky-resume.docx
+++ b/static/nathan-genetzky-resume.docx
@@ -1146,7 +1146,10 @@
     </w:p>
     <w:bookmarkEnd w:id="44"/>
     <w:bookmarkEnd w:id="45"/>
-    <w:sectPr/>
+    <w:sectPr>
+      <w:pgSz w:h="15840" w:w="12240"/>
+      <w:pgMar w:bottom="1080" w:footer="720" w:gutter="0" w:header="720" w:left="1080" w:right="1080" w:top="1080"/>
+    </w:sectPr>
   </w:body>
 </w:document>
 </file>

</xml_diff>

<commit_message>
static: regenerate all artifacts for the ATS restructure
Regenerated once from the final state of the branch: the ATS-restructured
content, the 11pt restyled docx and docx.pdf, and png/pdf/bw pdf as two
sheets at 10.3pt. Intermediate regenerations were squashed to avoid storing
superseded binaries.
</commit_message>
<xml_diff>
--- a/static/nathan-genetzky-resume.docx
+++ b/static/nathan-genetzky-resume.docx
@@ -13,139 +13,23 @@
         <w:t xml:space="preserve"> </w:t>
       </w:r>
       <w:r>
-        <w:t xml:space="preserve">Genetzky’s</w:t>
-      </w:r>
-      <w:r>
-        <w:t xml:space="preserve"> </w:t>
-      </w:r>
-      <w:r>
-        <w:t xml:space="preserve">Resume</w:t>
-      </w:r>
-    </w:p>
-    <w:p>
-      <w:pPr>
-        <w:pStyle w:val="Subtitle"/>
-      </w:pPr>
-      <w:r>
-        <w:t xml:space="preserve">Software</w:t>
-      </w:r>
-      <w:r>
-        <w:t xml:space="preserve"> </w:t>
-      </w:r>
-      <w:r>
-        <w:t xml:space="preserve">and</w:t>
-      </w:r>
-      <w:r>
-        <w:t xml:space="preserve"> </w:t>
-      </w:r>
-      <w:r>
-        <w:t xml:space="preserve">Hardware</w:t>
-      </w:r>
-    </w:p>
-    <w:p>
-      <w:pPr>
-        <w:pStyle w:val="Author"/>
-      </w:pPr>
-      <w:r>
-        <w:t xml:space="preserve">Nathan</w:t>
-      </w:r>
-      <w:r>
-        <w:t xml:space="preserve"> </w:t>
-      </w:r>
-      <w:r>
         <w:t xml:space="preserve">Genetzky</w:t>
       </w:r>
     </w:p>
-    <w:p>
-      <w:pPr>
-        <w:pStyle w:val="Date"/>
-      </w:pPr>
-      <w:r>
-        <w:t xml:space="preserve">2026-09-22</w:t>
-      </w:r>
-    </w:p>
-    <w:bookmarkStart w:id="20" w:name="career-profile"/>
+    <w:bookmarkStart w:id="26" w:name="contact"/>
     <w:p>
       <w:pPr>
         <w:pStyle w:val="Heading2"/>
       </w:pPr>
       <w:r>
-        <w:t xml:space="preserve">Career Profile</w:t>
-      </w:r>
-    </w:p>
-    <w:p>
-      <w:pPr>
-        <w:pStyle w:val="Compact"/>
-        <w:numPr>
-          <w:ilvl w:val="0"/>
-          <w:numId w:val="1001"/>
-        </w:numPr>
-      </w:pPr>
-      <w:r>
-        <w:t xml:space="preserve">Embedded Linux engineer with ~9 years taking connected products from board</w:t>
-      </w:r>
-      <w:r>
-        <w:t xml:space="preserve"> </w:t>
-      </w:r>
-      <w:r>
-        <w:t xml:space="preserve">bring-up through secure, field-updatable deployment.</w:t>
-      </w:r>
-    </w:p>
-    <w:p>
-      <w:pPr>
-        <w:pStyle w:val="Compact"/>
-        <w:numPr>
-          <w:ilvl w:val="0"/>
-          <w:numId w:val="1001"/>
-        </w:numPr>
-      </w:pPr>
-      <w:r>
-        <w:t xml:space="preserve">Yocto distributions, BSP and kernel work, CI/CD, and hardware-in-the-loop test.</w:t>
-      </w:r>
-    </w:p>
-    <w:p>
-      <w:pPr>
-        <w:pStyle w:val="Compact"/>
-        <w:numPr>
-          <w:ilvl w:val="0"/>
-          <w:numId w:val="1001"/>
-        </w:numPr>
-      </w:pPr>
-      <w:r>
-        <w:t xml:space="preserve">Product cybersecurity (EN 18031 / EU RED, secure boot, SBOM) and OTA update systems.</w:t>
-      </w:r>
-    </w:p>
-    <w:p>
-      <w:pPr>
-        <w:pStyle w:val="Compact"/>
-        <w:numPr>
-          <w:ilvl w:val="0"/>
-          <w:numId w:val="1001"/>
-        </w:numPr>
-      </w:pPr>
-      <w:r>
-        <w:t xml:space="preserve">Electrical Engineering graduate with honors distinction.</w:t>
-      </w:r>
-    </w:p>
-    <w:bookmarkEnd w:id="20"/>
-    <w:bookmarkStart w:id="27" w:name="contact"/>
-    <w:p>
-      <w:pPr>
-        <w:pStyle w:val="Heading2"/>
-      </w:pPr>
-      <w:r>
         <w:t xml:space="preserve">Contact</w:t>
       </w:r>
     </w:p>
     <w:p>
       <w:pPr>
-        <w:pStyle w:val="Compact"/>
-        <w:numPr>
-          <w:ilvl w:val="0"/>
-          <w:numId w:val="1002"/>
-        </w:numPr>
-      </w:pPr>
-      <w:hyperlink r:id="rId21">
+        <w:pStyle w:val="FirstParagraph"/>
+      </w:pPr>
+      <w:hyperlink r:id="rId20">
         <w:r>
           <w:rPr>
             <w:rStyle w:val="Hyperlink"/>
@@ -153,16 +37,16 @@
           <w:t xml:space="preserve">nathan@genetzky.us</w:t>
         </w:r>
       </w:hyperlink>
-    </w:p>
-    <w:p>
-      <w:pPr>
-        <w:pStyle w:val="Compact"/>
-        <w:numPr>
-          <w:ilvl w:val="0"/>
-          <w:numId w:val="1002"/>
-        </w:numPr>
-      </w:pPr>
-      <w:hyperlink r:id="rId22">
+      <w:r>
+        <w:t xml:space="preserve"> </w:t>
+      </w:r>
+      <w:r>
+        <w:t xml:space="preserve">| Minneapolis, MN |</w:t>
+      </w:r>
+      <w:r>
+        <w:t xml:space="preserve"> </w:t>
+      </w:r>
+      <w:hyperlink r:id="rId21">
         <w:r>
           <w:rPr>
             <w:rStyle w:val="Hyperlink"/>
@@ -170,16 +54,16 @@
           <w:t xml:space="preserve">academic.genetzky.us</w:t>
         </w:r>
       </w:hyperlink>
-    </w:p>
-    <w:p>
-      <w:pPr>
-        <w:pStyle w:val="Compact"/>
-        <w:numPr>
-          <w:ilvl w:val="0"/>
-          <w:numId w:val="1002"/>
-        </w:numPr>
-      </w:pPr>
-      <w:hyperlink r:id="rId23">
+      <w:r>
+        <w:t xml:space="preserve"> </w:t>
+      </w:r>
+      <w:r>
+        <w:t xml:space="preserve">|</w:t>
+      </w:r>
+      <w:r>
+        <w:t xml:space="preserve"> </w:t>
+      </w:r>
+      <w:hyperlink r:id="rId22">
         <w:r>
           <w:rPr>
             <w:rStyle w:val="Hyperlink"/>
@@ -187,16 +71,16 @@
           <w:t xml:space="preserve">linkedin.com/in/genetzky</w:t>
         </w:r>
       </w:hyperlink>
-    </w:p>
-    <w:p>
-      <w:pPr>
-        <w:pStyle w:val="Compact"/>
-        <w:numPr>
-          <w:ilvl w:val="0"/>
-          <w:numId w:val="1002"/>
-        </w:numPr>
-      </w:pPr>
-      <w:hyperlink r:id="rId24">
+      <w:r>
+        <w:t xml:space="preserve"> </w:t>
+      </w:r>
+      <w:r>
+        <w:t xml:space="preserve">|</w:t>
+      </w:r>
+      <w:r>
+        <w:t xml:space="preserve"> </w:t>
+      </w:r>
+      <w:hyperlink r:id="rId23">
         <w:r>
           <w:rPr>
             <w:rStyle w:val="Hyperlink"/>
@@ -204,16 +88,16 @@
           <w:t xml:space="preserve">github.com/NGenetzky</w:t>
         </w:r>
       </w:hyperlink>
-    </w:p>
-    <w:p>
-      <w:pPr>
-        <w:pStyle w:val="Compact"/>
-        <w:numPr>
-          <w:ilvl w:val="0"/>
-          <w:numId w:val="1002"/>
-        </w:numPr>
-      </w:pPr>
-      <w:hyperlink r:id="rId25">
+      <w:r>
+        <w:t xml:space="preserve"> </w:t>
+      </w:r>
+      <w:r>
+        <w:t xml:space="preserve">|</w:t>
+      </w:r>
+      <w:r>
+        <w:t xml:space="preserve"> </w:t>
+      </w:r>
+      <w:hyperlink r:id="rId24">
         <w:r>
           <w:rPr>
             <w:rStyle w:val="Hyperlink"/>
@@ -221,16 +105,16 @@
           <w:t xml:space="preserve">twitter.com/ngenetzky</w:t>
         </w:r>
       </w:hyperlink>
-    </w:p>
-    <w:p>
-      <w:pPr>
-        <w:pStyle w:val="Compact"/>
-        <w:numPr>
-          <w:ilvl w:val="0"/>
-          <w:numId w:val="1002"/>
-        </w:numPr>
-      </w:pPr>
-      <w:hyperlink r:id="rId26">
+      <w:r>
+        <w:t xml:space="preserve"> </w:t>
+      </w:r>
+      <w:r>
+        <w:t xml:space="preserve">|</w:t>
+      </w:r>
+      <w:r>
+        <w:t xml:space="preserve"> </w:t>
+      </w:r>
+      <w:hyperlink r:id="rId25">
         <w:r>
           <w:rPr>
             <w:rStyle w:val="Hyperlink"/>
@@ -239,20 +123,238 @@
         </w:r>
       </w:hyperlink>
     </w:p>
+    <w:bookmarkEnd w:id="26"/>
+    <w:bookmarkStart w:id="27" w:name="summary"/>
+    <w:p>
+      <w:pPr>
+        <w:pStyle w:val="Heading2"/>
+      </w:pPr>
+      <w:r>
+        <w:t xml:space="preserve">Summary</w:t>
+      </w:r>
+    </w:p>
+    <w:p>
+      <w:pPr>
+        <w:pStyle w:val="Compact"/>
+        <w:numPr>
+          <w:ilvl w:val="0"/>
+          <w:numId w:val="1001"/>
+        </w:numPr>
+      </w:pPr>
+      <w:r>
+        <w:t xml:space="preserve">Embedded Linux engineer with ~9 years taking connected products from board</w:t>
+      </w:r>
+      <w:r>
+        <w:t xml:space="preserve"> </w:t>
+      </w:r>
+      <w:r>
+        <w:t xml:space="preserve">bring-up through secure, field-updatable deployment.</w:t>
+      </w:r>
+    </w:p>
+    <w:p>
+      <w:pPr>
+        <w:pStyle w:val="Compact"/>
+        <w:numPr>
+          <w:ilvl w:val="0"/>
+          <w:numId w:val="1001"/>
+        </w:numPr>
+      </w:pPr>
+      <w:r>
+        <w:t xml:space="preserve">Yocto distributions, BSP and kernel work, CI/CD, and hardware-in-the-loop test.</w:t>
+      </w:r>
+    </w:p>
+    <w:p>
+      <w:pPr>
+        <w:pStyle w:val="Compact"/>
+        <w:numPr>
+          <w:ilvl w:val="0"/>
+          <w:numId w:val="1001"/>
+        </w:numPr>
+      </w:pPr>
+      <w:r>
+        <w:t xml:space="preserve">Product cybersecurity (EN 18031 / EU RED, secure boot, SBOM) and OTA update systems.</w:t>
+      </w:r>
+    </w:p>
+    <w:p>
+      <w:pPr>
+        <w:pStyle w:val="Compact"/>
+        <w:numPr>
+          <w:ilvl w:val="0"/>
+          <w:numId w:val="1001"/>
+        </w:numPr>
+      </w:pPr>
+      <w:r>
+        <w:t xml:space="preserve">Electrical Engineering graduate with honors distinction.</w:t>
+      </w:r>
+    </w:p>
+    <w:p>
+      <w:pPr>
+        <w:pStyle w:val="Compact"/>
+        <w:numPr>
+          <w:ilvl w:val="0"/>
+          <w:numId w:val="1001"/>
+        </w:numPr>
+      </w:pPr>
+      <w:r>
+        <w:t xml:space="preserve">Open to hybrid and remote roles.</w:t>
+      </w:r>
+    </w:p>
     <w:bookmarkEnd w:id="27"/>
-    <w:bookmarkStart w:id="33" w:name="experiences"/>
+    <w:bookmarkStart w:id="28" w:name="skills"/>
     <w:p>
       <w:pPr>
         <w:pStyle w:val="Heading2"/>
       </w:pPr>
       <w:r>
-        <w:t xml:space="preserve">Experiences</w:t>
-      </w:r>
-    </w:p>
-    <w:bookmarkStart w:id="28" w:name="senior-software-engineer"/>
-    <w:p>
-      <w:pPr>
-        <w:pStyle w:val="Heading4"/>
+        <w:t xml:space="preserve">Skills</w:t>
+      </w:r>
+    </w:p>
+    <w:p>
+      <w:pPr>
+        <w:pStyle w:val="Compact"/>
+        <w:numPr>
+          <w:ilvl w:val="0"/>
+          <w:numId w:val="1002"/>
+        </w:numPr>
+      </w:pPr>
+      <w:r>
+        <w:rPr>
+          <w:b/>
+          <w:bCs/>
+        </w:rPr>
+        <w:t xml:space="preserve">Embedded Linux:</w:t>
+      </w:r>
+      <w:r>
+        <w:t xml:space="preserve"> </w:t>
+      </w:r>
+      <w:r>
+        <w:t xml:space="preserve">Yocto Project, BitBake, BSP, Linux kernel drivers and config, U-Boot, i.MX8 (IMX8DXL), cross-compilation SDKs</w:t>
+      </w:r>
+    </w:p>
+    <w:p>
+      <w:pPr>
+        <w:pStyle w:val="Compact"/>
+        <w:numPr>
+          <w:ilvl w:val="0"/>
+          <w:numId w:val="1002"/>
+        </w:numPr>
+      </w:pPr>
+      <w:r>
+        <w:rPr>
+          <w:b/>
+          <w:bCs/>
+        </w:rPr>
+        <w:t xml:space="preserve">Security &amp; Updates:</w:t>
+      </w:r>
+      <w:r>
+        <w:t xml:space="preserve"> </w:t>
+      </w:r>
+      <w:r>
+        <w:t xml:space="preserve">secure boot, signed firmware images, threat modeling, secure element key management, SBOM, EN 18031 / EU RED, CRA, RAUC OTA, A/B partitioning</w:t>
+      </w:r>
+    </w:p>
+    <w:p>
+      <w:pPr>
+        <w:pStyle w:val="Compact"/>
+        <w:numPr>
+          <w:ilvl w:val="0"/>
+          <w:numId w:val="1002"/>
+        </w:numPr>
+      </w:pPr>
+      <w:r>
+        <w:rPr>
+          <w:b/>
+          <w:bCs/>
+        </w:rPr>
+        <w:t xml:space="preserve">Build, CI &amp; Test:</w:t>
+      </w:r>
+      <w:r>
+        <w:t xml:space="preserve"> </w:t>
+      </w:r>
+      <w:r>
+        <w:t xml:space="preserve">Docker, Jenkins, Git, GitOps, Gitflow, HIL testing, Labgrid</w:t>
+      </w:r>
+    </w:p>
+    <w:p>
+      <w:pPr>
+        <w:pStyle w:val="Compact"/>
+        <w:numPr>
+          <w:ilvl w:val="0"/>
+          <w:numId w:val="1002"/>
+        </w:numPr>
+      </w:pPr>
+      <w:r>
+        <w:rPr>
+          <w:b/>
+          <w:bCs/>
+        </w:rPr>
+        <w:t xml:space="preserve">Debug &amp; Hardware:</w:t>
+      </w:r>
+      <w:r>
+        <w:t xml:space="preserve"> </w:t>
+      </w:r>
+      <w:r>
+        <w:t xml:space="preserve">JTAG/SWD, GDB, logic analyzer, oscilloscope, CAN bus, cellular modems, WiFi, Bluetooth/BLE, STM32, nRF52, FPGA/Verilog</w:t>
+      </w:r>
+    </w:p>
+    <w:p>
+      <w:pPr>
+        <w:pStyle w:val="Compact"/>
+        <w:numPr>
+          <w:ilvl w:val="0"/>
+          <w:numId w:val="1002"/>
+        </w:numPr>
+      </w:pPr>
+      <w:r>
+        <w:rPr>
+          <w:b/>
+          <w:bCs/>
+        </w:rPr>
+        <w:t xml:space="preserve">Tools &amp; Middleware:</w:t>
+      </w:r>
+      <w:r>
+        <w:t xml:space="preserve"> </w:t>
+      </w:r>
+      <w:r>
+        <w:t xml:space="preserve">Vim, GNU tools, shell scripting, DBus, REST, GObject, Jira, Puppet</w:t>
+      </w:r>
+    </w:p>
+    <w:bookmarkEnd w:id="28"/>
+    <w:bookmarkStart w:id="29" w:name="languages"/>
+    <w:p>
+      <w:pPr>
+        <w:pStyle w:val="Heading2"/>
+      </w:pPr>
+      <w:r>
+        <w:t xml:space="preserve">Languages</w:t>
+      </w:r>
+    </w:p>
+    <w:p>
+      <w:pPr>
+        <w:pStyle w:val="Compact"/>
+        <w:numPr>
+          <w:ilvl w:val="0"/>
+          <w:numId w:val="1003"/>
+        </w:numPr>
+      </w:pPr>
+      <w:r>
+        <w:t xml:space="preserve">Bash (~10 years), Python (~8 years), C++ (~9 years), C (~7 years), Dockerfile (~5 years), Java for Android (~1 year)</w:t>
+      </w:r>
+    </w:p>
+    <w:bookmarkEnd w:id="29"/>
+    <w:bookmarkStart w:id="35" w:name="experience"/>
+    <w:p>
+      <w:pPr>
+        <w:pStyle w:val="Heading2"/>
+      </w:pPr>
+      <w:r>
+        <w:t xml:space="preserve">Experience</w:t>
+      </w:r>
+    </w:p>
+    <w:bookmarkStart w:id="30" w:name="senior-software-engineer"/>
+    <w:p>
+      <w:pPr>
+        <w:pStyle w:val="Heading3"/>
       </w:pPr>
       <w:r>
         <w:t xml:space="preserve">Senior Software Engineer</w:t>
@@ -263,15 +365,15 @@
         <w:pStyle w:val="FirstParagraph"/>
       </w:pPr>
       <w:r>
-        <w:t xml:space="preserve">PTx, AGCO’s Precision Agriculture Technology business (04.2024 - PRESENT)</w:t>
-      </w:r>
-    </w:p>
-    <w:p>
-      <w:pPr>
-        <w:pStyle w:val="Compact"/>
-        <w:numPr>
-          <w:ilvl w:val="0"/>
-          <w:numId w:val="1003"/>
+        <w:t xml:space="preserve">PTx, AGCO’s Precision Agriculture Technology business (Apr 2024 – Present)</w:t>
+      </w:r>
+    </w:p>
+    <w:p>
+      <w:pPr>
+        <w:pStyle w:val="Compact"/>
+        <w:numPr>
+          <w:ilvl w:val="0"/>
+          <w:numId w:val="1004"/>
         </w:numPr>
       </w:pPr>
       <w:r>
@@ -289,7 +391,7 @@
         <w:pStyle w:val="Compact"/>
         <w:numPr>
           <w:ilvl w:val="0"/>
-          <w:numId w:val="1003"/>
+          <w:numId w:val="1004"/>
         </w:numPr>
       </w:pPr>
       <w:r>
@@ -313,7 +415,7 @@
         <w:pStyle w:val="Compact"/>
         <w:numPr>
           <w:ilvl w:val="0"/>
-          <w:numId w:val="1003"/>
+          <w:numId w:val="1004"/>
         </w:numPr>
       </w:pPr>
       <w:r>
@@ -331,7 +433,7 @@
         <w:pStyle w:val="Compact"/>
         <w:numPr>
           <w:ilvl w:val="0"/>
-          <w:numId w:val="1003"/>
+          <w:numId w:val="1004"/>
         </w:numPr>
       </w:pPr>
       <w:r>
@@ -343,7 +445,7 @@
         <w:pStyle w:val="Compact"/>
         <w:numPr>
           <w:ilvl w:val="0"/>
-          <w:numId w:val="1003"/>
+          <w:numId w:val="1004"/>
         </w:numPr>
       </w:pPr>
       <w:r>
@@ -367,7 +469,7 @@
         <w:pStyle w:val="Compact"/>
         <w:numPr>
           <w:ilvl w:val="0"/>
-          <w:numId w:val="1003"/>
+          <w:numId w:val="1004"/>
         </w:numPr>
       </w:pPr>
       <w:r>
@@ -379,7 +481,7 @@
         <w:pStyle w:val="Compact"/>
         <w:numPr>
           <w:ilvl w:val="0"/>
-          <w:numId w:val="1003"/>
+          <w:numId w:val="1004"/>
         </w:numPr>
       </w:pPr>
       <w:r>
@@ -398,11 +500,11 @@
         <w:t xml:space="preserve">on where generated code is not trusted without verification.</w:t>
       </w:r>
     </w:p>
-    <w:bookmarkEnd w:id="28"/>
-    <w:bookmarkStart w:id="29" w:name="senior-software-engineer-1"/>
-    <w:p>
-      <w:pPr>
-        <w:pStyle w:val="Heading4"/>
+    <w:bookmarkEnd w:id="30"/>
+    <w:bookmarkStart w:id="31" w:name="senior-software-engineer-1"/>
+    <w:p>
+      <w:pPr>
+        <w:pStyle w:val="Heading3"/>
       </w:pPr>
       <w:r>
         <w:t xml:space="preserve">Senior Software Engineer</w:t>
@@ -413,15 +515,15 @@
         <w:pStyle w:val="FirstParagraph"/>
       </w:pPr>
       <w:r>
-        <w:t xml:space="preserve">ESW Team at Appareo Systems (acquired by AGCO, 01.2022) (12.2021 - 04.2024)</w:t>
-      </w:r>
-    </w:p>
-    <w:p>
-      <w:pPr>
-        <w:pStyle w:val="Compact"/>
-        <w:numPr>
-          <w:ilvl w:val="0"/>
-          <w:numId w:val="1004"/>
+        <w:t xml:space="preserve">ESW Team at Appareo Systems (acquired by AGCO, Jan 2022) (Dec 2021 – Apr 2024)</w:t>
+      </w:r>
+    </w:p>
+    <w:p>
+      <w:pPr>
+        <w:pStyle w:val="Compact"/>
+        <w:numPr>
+          <w:ilvl w:val="0"/>
+          <w:numId w:val="1005"/>
         </w:numPr>
       </w:pPr>
       <w:r>
@@ -439,7 +541,7 @@
         <w:pStyle w:val="Compact"/>
         <w:numPr>
           <w:ilvl w:val="0"/>
-          <w:numId w:val="1004"/>
+          <w:numId w:val="1005"/>
         </w:numPr>
       </w:pPr>
       <w:r>
@@ -451,7 +553,7 @@
         <w:pStyle w:val="Compact"/>
         <w:numPr>
           <w:ilvl w:val="0"/>
-          <w:numId w:val="1004"/>
+          <w:numId w:val="1005"/>
         </w:numPr>
       </w:pPr>
       <w:r>
@@ -469,7 +571,7 @@
         <w:pStyle w:val="Compact"/>
         <w:numPr>
           <w:ilvl w:val="0"/>
-          <w:numId w:val="1004"/>
+          <w:numId w:val="1005"/>
         </w:numPr>
       </w:pPr>
       <w:r>
@@ -481,18 +583,18 @@
         <w:pStyle w:val="Compact"/>
         <w:numPr>
           <w:ilvl w:val="0"/>
-          <w:numId w:val="1004"/>
+          <w:numId w:val="1005"/>
         </w:numPr>
       </w:pPr>
       <w:r>
         <w:t xml:space="preserve">Generated SDKs and docker images for quick cross-compilation of C++ Applications.</w:t>
       </w:r>
     </w:p>
-    <w:bookmarkEnd w:id="29"/>
-    <w:bookmarkStart w:id="30" w:name="software-engineer-1"/>
-    <w:p>
-      <w:pPr>
-        <w:pStyle w:val="Heading4"/>
+    <w:bookmarkEnd w:id="31"/>
+    <w:bookmarkStart w:id="32" w:name="software-engineer-1"/>
+    <w:p>
+      <w:pPr>
+        <w:pStyle w:val="Heading3"/>
       </w:pPr>
       <w:r>
         <w:t xml:space="preserve">Software Engineer 1</w:t>
@@ -503,15 +605,15 @@
         <w:pStyle w:val="FirstParagraph"/>
       </w:pPr>
       <w:r>
-        <w:t xml:space="preserve">System Team at Vaddio (05.2017 - 12.2021)</w:t>
-      </w:r>
-    </w:p>
-    <w:p>
-      <w:pPr>
-        <w:pStyle w:val="Compact"/>
-        <w:numPr>
-          <w:ilvl w:val="0"/>
-          <w:numId w:val="1005"/>
+        <w:t xml:space="preserve">System Team at Vaddio (May 2017 – Dec 2021)</w:t>
+      </w:r>
+    </w:p>
+    <w:p>
+      <w:pPr>
+        <w:pStyle w:val="Compact"/>
+        <w:numPr>
+          <w:ilvl w:val="0"/>
+          <w:numId w:val="1006"/>
         </w:numPr>
       </w:pPr>
       <w:r>
@@ -529,7 +631,7 @@
         <w:pStyle w:val="Compact"/>
         <w:numPr>
           <w:ilvl w:val="0"/>
-          <w:numId w:val="1005"/>
+          <w:numId w:val="1006"/>
         </w:numPr>
       </w:pPr>
       <w:r>
@@ -559,7 +661,7 @@
         <w:pStyle w:val="Compact"/>
         <w:numPr>
           <w:ilvl w:val="0"/>
-          <w:numId w:val="1005"/>
+          <w:numId w:val="1006"/>
         </w:numPr>
       </w:pPr>
       <w:r>
@@ -572,11 +674,11 @@
         <w:t xml:space="preserve">Git, Bitbake, and Puppet.</w:t>
       </w:r>
     </w:p>
-    <w:bookmarkEnd w:id="30"/>
-    <w:bookmarkStart w:id="31" w:name="software-engineer"/>
-    <w:p>
-      <w:pPr>
-        <w:pStyle w:val="Heading4"/>
+    <w:bookmarkEnd w:id="32"/>
+    <w:bookmarkStart w:id="33" w:name="software-engineer"/>
+    <w:p>
+      <w:pPr>
+        <w:pStyle w:val="Heading3"/>
       </w:pPr>
       <w:r>
         <w:t xml:space="preserve">Software Engineer</w:t>
@@ -587,15 +689,15 @@
         <w:pStyle w:val="FirstParagraph"/>
       </w:pPr>
       <w:r>
-        <w:t xml:space="preserve">Dojo Five (11.2018 - 12.2021)</w:t>
-      </w:r>
-    </w:p>
-    <w:p>
-      <w:pPr>
-        <w:pStyle w:val="Compact"/>
-        <w:numPr>
-          <w:ilvl w:val="0"/>
-          <w:numId w:val="1006"/>
+        <w:t xml:space="preserve">Dojo Five (Nov 2018 – Dec 2021)</w:t>
+      </w:r>
+    </w:p>
+    <w:p>
+      <w:pPr>
+        <w:pStyle w:val="Compact"/>
+        <w:numPr>
+          <w:ilvl w:val="0"/>
+          <w:numId w:val="1007"/>
         </w:numPr>
       </w:pPr>
       <w:r>
@@ -607,7 +709,7 @@
         <w:pStyle w:val="Compact"/>
         <w:numPr>
           <w:ilvl w:val="0"/>
-          <w:numId w:val="1006"/>
+          <w:numId w:val="1007"/>
         </w:numPr>
       </w:pPr>
       <w:r>
@@ -619,18 +721,18 @@
         <w:pStyle w:val="Compact"/>
         <w:numPr>
           <w:ilvl w:val="0"/>
-          <w:numId w:val="1006"/>
+          <w:numId w:val="1007"/>
         </w:numPr>
       </w:pPr>
       <w:r>
         <w:t xml:space="preserve">Developed with NRF52 SDK to create devices in a complex robotic system with BLE services</w:t>
       </w:r>
     </w:p>
-    <w:bookmarkEnd w:id="31"/>
-    <w:bookmarkStart w:id="32" w:name="embedded-linux-and-ota-experiments"/>
-    <w:p>
-      <w:pPr>
-        <w:pStyle w:val="Heading4"/>
+    <w:bookmarkEnd w:id="33"/>
+    <w:bookmarkStart w:id="34" w:name="embedded-linux-and-ota-experiments"/>
+    <w:p>
+      <w:pPr>
+        <w:pStyle w:val="Heading3"/>
       </w:pPr>
       <w:r>
         <w:t xml:space="preserve">Embedded Linux and OTA Experiments</w:t>
@@ -641,15 +743,15 @@
         <w:pStyle w:val="FirstParagraph"/>
       </w:pPr>
       <w:r>
-        <w:t xml:space="preserve">Personal projects, self-directed (ONGOING)</w:t>
-      </w:r>
-    </w:p>
-    <w:p>
-      <w:pPr>
-        <w:pStyle w:val="Compact"/>
-        <w:numPr>
-          <w:ilvl w:val="0"/>
-          <w:numId w:val="1007"/>
+        <w:t xml:space="preserve">Personal projects, self-directed (Ongoing)</w:t>
+      </w:r>
+    </w:p>
+    <w:p>
+      <w:pPr>
+        <w:pStyle w:val="Compact"/>
+        <w:numPr>
+          <w:ilvl w:val="0"/>
+          <w:numId w:val="1008"/>
         </w:numPr>
       </w:pPr>
       <w:r>
@@ -673,7 +775,7 @@
         <w:pStyle w:val="Compact"/>
         <w:numPr>
           <w:ilvl w:val="0"/>
-          <w:numId w:val="1007"/>
+          <w:numId w:val="1008"/>
         </w:numPr>
       </w:pPr>
       <w:r>
@@ -686,21 +788,49 @@
         <w:t xml:space="preserve">of containerized applications to embedded targets.</w:t>
       </w:r>
     </w:p>
-    <w:bookmarkEnd w:id="32"/>
-    <w:bookmarkEnd w:id="33"/>
-    <w:bookmarkStart w:id="45" w:name="projects"/>
+    <w:bookmarkEnd w:id="34"/>
+    <w:bookmarkEnd w:id="35"/>
+    <w:bookmarkStart w:id="37" w:name="education"/>
     <w:p>
       <w:pPr>
         <w:pStyle w:val="Heading2"/>
       </w:pPr>
       <w:r>
+        <w:t xml:space="preserve">Education</w:t>
+      </w:r>
+    </w:p>
+    <w:bookmarkStart w:id="36" w:name="X61bfcdf9286c59bad2cbf3fefa2d287539738f6"/>
+    <w:p>
+      <w:pPr>
+        <w:pStyle w:val="Heading3"/>
+      </w:pPr>
+      <w:r>
+        <w:t xml:space="preserve">BS Electrical Engineering, Minor in Software Engineering</w:t>
+      </w:r>
+    </w:p>
+    <w:p>
+      <w:pPr>
+        <w:pStyle w:val="FirstParagraph"/>
+      </w:pPr>
+      <w:r>
+        <w:t xml:space="preserve">South Dakota State University (2012 – 2017)</w:t>
+      </w:r>
+    </w:p>
+    <w:bookmarkEnd w:id="36"/>
+    <w:bookmarkEnd w:id="37"/>
+    <w:bookmarkStart w:id="46" w:name="projects"/>
+    <w:p>
+      <w:pPr>
+        <w:pStyle w:val="Heading2"/>
+      </w:pPr>
+      <w:r>
         <w:t xml:space="preserve">Projects</w:t>
       </w:r>
     </w:p>
-    <w:bookmarkStart w:id="35" w:name="Xf974c0d12b9b8cbd394ec49fb57f23955fed171"/>
-    <w:p>
-      <w:pPr>
-        <w:pStyle w:val="Heading4"/>
+    <w:bookmarkStart w:id="39" w:name="Xf974c0d12b9b8cbd394ec49fb57f23955fed171"/>
+    <w:p>
+      <w:pPr>
+        <w:pStyle w:val="Heading3"/>
       </w:pPr>
       <w:r>
         <w:t xml:space="preserve">Hardware Integrated Prototyping Environment at SDSU Engineering Expo</w:t>
@@ -711,7 +841,7 @@
         <w:pStyle w:val="Compact"/>
         <w:numPr>
           <w:ilvl w:val="0"/>
-          <w:numId w:val="1008"/>
+          <w:numId w:val="1009"/>
         </w:numPr>
       </w:pPr>
       <w:r>
@@ -723,10 +853,10 @@
         <w:pStyle w:val="Compact"/>
         <w:numPr>
           <w:ilvl w:val="0"/>
-          <w:numId w:val="1008"/>
-        </w:numPr>
-      </w:pPr>
-      <w:hyperlink r:id="rId34">
+          <w:numId w:val="1009"/>
+        </w:numPr>
+      </w:pPr>
+      <w:hyperlink r:id="rId38">
         <w:r>
           <w:rPr>
             <w:rStyle w:val="Hyperlink"/>
@@ -735,11 +865,11 @@
         </w:r>
       </w:hyperlink>
     </w:p>
-    <w:bookmarkEnd w:id="35"/>
-    <w:bookmarkStart w:id="36" w:name="X3d3d2f335dee6258fac26945b027a3aa4174c3b"/>
-    <w:p>
-      <w:pPr>
-        <w:pStyle w:val="Heading4"/>
+    <w:bookmarkEnd w:id="39"/>
+    <w:bookmarkStart w:id="41" w:name="X3d3d2f335dee6258fac26945b027a3aa4174c3b"/>
+    <w:p>
+      <w:pPr>
+        <w:pStyle w:val="Heading3"/>
       </w:pPr>
       <w:r>
         <w:t xml:space="preserve">Design and Verification of a SPI to JTAG Interface Adapter</w:t>
@@ -750,7 +880,7 @@
         <w:pStyle w:val="Compact"/>
         <w:numPr>
           <w:ilvl w:val="0"/>
-          <w:numId w:val="1009"/>
+          <w:numId w:val="1010"/>
         </w:numPr>
       </w:pPr>
       <w:r>
@@ -762,10 +892,10 @@
         <w:pStyle w:val="Compact"/>
         <w:numPr>
           <w:ilvl w:val="0"/>
-          <w:numId w:val="1009"/>
-        </w:numPr>
-      </w:pPr>
-      <w:hyperlink r:id="rId34">
+          <w:numId w:val="1010"/>
+        </w:numPr>
+      </w:pPr>
+      <w:hyperlink r:id="rId40">
         <w:r>
           <w:rPr>
             <w:rStyle w:val="Hyperlink"/>
@@ -774,11 +904,11 @@
         </w:r>
       </w:hyperlink>
     </w:p>
-    <w:bookmarkEnd w:id="36"/>
-    <w:bookmarkStart w:id="37" w:name="X88a4495dfd18e3ff5fd7b652851687dfea54d21"/>
-    <w:p>
-      <w:pPr>
-        <w:pStyle w:val="Heading4"/>
+    <w:bookmarkEnd w:id="41"/>
+    <w:bookmarkStart w:id="43" w:name="X88a4495dfd18e3ff5fd7b652851687dfea54d21"/>
+    <w:p>
+      <w:pPr>
+        <w:pStyle w:val="Heading3"/>
       </w:pPr>
       <w:r>
         <w:t xml:space="preserve">Interactive User Interface with PIC18 Microcontroller</w:t>
@@ -789,7 +919,7 @@
         <w:pStyle w:val="Compact"/>
         <w:numPr>
           <w:ilvl w:val="0"/>
-          <w:numId w:val="1010"/>
+          <w:numId w:val="1011"/>
         </w:numPr>
       </w:pPr>
       <w:r>
@@ -801,10 +931,10 @@
         <w:pStyle w:val="Compact"/>
         <w:numPr>
           <w:ilvl w:val="0"/>
-          <w:numId w:val="1010"/>
-        </w:numPr>
-      </w:pPr>
-      <w:hyperlink r:id="rId34">
+          <w:numId w:val="1011"/>
+        </w:numPr>
+      </w:pPr>
+      <w:hyperlink r:id="rId42">
         <w:r>
           <w:rPr>
             <w:rStyle w:val="Hyperlink"/>
@@ -813,11 +943,11 @@
         </w:r>
       </w:hyperlink>
     </w:p>
-    <w:bookmarkEnd w:id="37"/>
-    <w:bookmarkStart w:id="38" w:name="particle-projects"/>
-    <w:p>
-      <w:pPr>
-        <w:pStyle w:val="Heading4"/>
+    <w:bookmarkEnd w:id="43"/>
+    <w:bookmarkStart w:id="45" w:name="particle-projects"/>
+    <w:p>
+      <w:pPr>
+        <w:pStyle w:val="Heading3"/>
       </w:pPr>
       <w:r>
         <w:t xml:space="preserve">Particle Projects</w:t>
@@ -828,7 +958,7 @@
         <w:pStyle w:val="Compact"/>
         <w:numPr>
           <w:ilvl w:val="0"/>
-          <w:numId w:val="1011"/>
+          <w:numId w:val="1012"/>
         </w:numPr>
       </w:pPr>
       <w:r>
@@ -840,10 +970,10 @@
         <w:pStyle w:val="Compact"/>
         <w:numPr>
           <w:ilvl w:val="0"/>
-          <w:numId w:val="1011"/>
-        </w:numPr>
-      </w:pPr>
-      <w:hyperlink r:id="rId34">
+          <w:numId w:val="1012"/>
+        </w:numPr>
+      </w:pPr>
+      <w:hyperlink r:id="rId44">
         <w:r>
           <w:rPr>
             <w:rStyle w:val="Hyperlink"/>
@@ -852,142 +982,15 @@
         </w:r>
       </w:hyperlink>
     </w:p>
-    <w:bookmarkEnd w:id="38"/>
-    <w:bookmarkStart w:id="39" w:name="skills-proficiency"/>
-    <w:p>
-      <w:pPr>
-        <w:pStyle w:val="Heading3"/>
-      </w:pPr>
-      <w:r>
-        <w:t xml:space="preserve">Skills &amp; Proficiency</w:t>
-      </w:r>
-    </w:p>
-    <w:p>
-      <w:pPr>
-        <w:pStyle w:val="Compact"/>
-        <w:numPr>
-          <w:ilvl w:val="0"/>
-          <w:numId w:val="1012"/>
-        </w:numPr>
-      </w:pPr>
-      <w:r>
-        <w:t xml:space="preserve">Yocto (Build System, Embedded Distro, BSP Support) (90%)</w:t>
-      </w:r>
-    </w:p>
-    <w:p>
-      <w:pPr>
-        <w:pStyle w:val="Compact"/>
-        <w:numPr>
-          <w:ilvl w:val="0"/>
-          <w:numId w:val="1012"/>
-        </w:numPr>
-      </w:pPr>
-      <w:r>
-        <w:t xml:space="preserve">Developer Tools (Docker, Jenkins, Git, GDB, JTAG/SWD) (85%)</w:t>
-      </w:r>
-    </w:p>
-    <w:p>
-      <w:pPr>
-        <w:pStyle w:val="Compact"/>
-        <w:numPr>
-          <w:ilvl w:val="0"/>
-          <w:numId w:val="1012"/>
-        </w:numPr>
-      </w:pPr>
-      <w:r>
-        <w:t xml:space="preserve">Terminal Workflow (Vim, GNU tools, shell scripting) (85%)</w:t>
-      </w:r>
-    </w:p>
-    <w:p>
-      <w:pPr>
-        <w:pStyle w:val="Compact"/>
-        <w:numPr>
-          <w:ilvl w:val="0"/>
-          <w:numId w:val="1012"/>
-        </w:numPr>
-      </w:pPr>
-      <w:r>
-        <w:t xml:space="preserve">Linux Kernel (Drivers, Config, BSP) (55%)</w:t>
-      </w:r>
-    </w:p>
-    <w:p>
-      <w:pPr>
-        <w:pStyle w:val="Compact"/>
-        <w:numPr>
-          <w:ilvl w:val="0"/>
-          <w:numId w:val="1012"/>
-        </w:numPr>
-      </w:pPr>
-      <w:r>
-        <w:t xml:space="preserve">Python Middleware (DBus, REST, GObject, threading) (35%)</w:t>
-      </w:r>
-    </w:p>
-    <w:p>
-      <w:pPr>
-        <w:pStyle w:val="Compact"/>
-        <w:numPr>
-          <w:ilvl w:val="0"/>
-          <w:numId w:val="1012"/>
-        </w:numPr>
-      </w:pPr>
-      <w:r>
-        <w:t xml:space="preserve">FPGA Development (SW Interface, Reusable Verilog, Automated Builds) (25%)</w:t>
-      </w:r>
-    </w:p>
-    <w:bookmarkEnd w:id="39"/>
-    <w:bookmarkStart w:id="42" w:name="education"/>
-    <w:p>
-      <w:pPr>
-        <w:pStyle w:val="Heading3"/>
-      </w:pPr>
-      <w:r>
-        <w:t xml:space="preserve">Education</w:t>
-      </w:r>
-    </w:p>
-    <w:bookmarkStart w:id="40" w:name="bs-electrical-engineering"/>
-    <w:p>
-      <w:pPr>
-        <w:pStyle w:val="Heading5"/>
-      </w:pPr>
-      <w:r>
-        <w:t xml:space="preserve">BS Electrical Engineering</w:t>
-      </w:r>
-    </w:p>
-    <w:p>
-      <w:pPr>
-        <w:pStyle w:val="FirstParagraph"/>
-      </w:pPr>
-      <w:r>
-        <w:t xml:space="preserve">South Dakota State University (2012 - 2017)</w:t>
-      </w:r>
-    </w:p>
-    <w:bookmarkEnd w:id="40"/>
-    <w:bookmarkStart w:id="41" w:name="minor-software-engineering"/>
-    <w:p>
-      <w:pPr>
-        <w:pStyle w:val="Heading5"/>
-      </w:pPr>
-      <w:r>
-        <w:t xml:space="preserve">Minor Software Engineering</w:t>
-      </w:r>
-    </w:p>
-    <w:p>
-      <w:pPr>
-        <w:pStyle w:val="FirstParagraph"/>
-      </w:pPr>
-      <w:r>
-        <w:t xml:space="preserve">South Dakota State University (2012 - 2017)</w:t>
-      </w:r>
-    </w:p>
-    <w:bookmarkEnd w:id="41"/>
-    <w:bookmarkEnd w:id="42"/>
-    <w:bookmarkStart w:id="43" w:name="lauguages"/>
-    <w:p>
-      <w:pPr>
-        <w:pStyle w:val="Heading3"/>
-      </w:pPr>
-      <w:r>
-        <w:t xml:space="preserve">Lauguages</w:t>
+    <w:bookmarkEnd w:id="45"/>
+    <w:bookmarkEnd w:id="46"/>
+    <w:bookmarkStart w:id="47" w:name="interests"/>
+    <w:p>
+      <w:pPr>
+        <w:pStyle w:val="Heading2"/>
+      </w:pPr>
+      <w:r>
+        <w:t xml:space="preserve">Interests</w:t>
       </w:r>
     </w:p>
     <w:p>
@@ -999,7 +1002,7 @@
         </w:numPr>
       </w:pPr>
       <w:r>
-        <w:t xml:space="preserve">Bash (~10 years)</w:t>
+        <w:t xml:space="preserve">hobby-electronics, home automation, embedded-linux</w:t>
       </w:r>
     </w:p>
     <w:p>
@@ -1011,7 +1014,7 @@
         </w:numPr>
       </w:pPr>
       <w:r>
-        <w:t xml:space="preserve">Python (~8 years)</w:t>
+        <w:t xml:space="preserve">ice and rock climbing</w:t>
       </w:r>
     </w:p>
     <w:p>
@@ -1023,7 +1026,7 @@
         </w:numPr>
       </w:pPr>
       <w:r>
-        <w:t xml:space="preserve">C++ (~9 years)</w:t>
+        <w:t xml:space="preserve">snowboarding and skiing</w:t>
       </w:r>
     </w:p>
     <w:p>
@@ -1035,7 +1038,7 @@
         </w:numPr>
       </w:pPr>
       <w:r>
-        <w:t xml:space="preserve">C (~7 years)</w:t>
+        <w:t xml:space="preserve">gardening, cooking</w:t>
       </w:r>
     </w:p>
     <w:p>
@@ -1047,7 +1050,7 @@
         </w:numPr>
       </w:pPr>
       <w:r>
-        <w:t xml:space="preserve">Dockerfile (~5 years)</w:t>
+        <w:t xml:space="preserve">jetsking, boating, water skiing</w:t>
       </w:r>
     </w:p>
     <w:p>
@@ -1059,93 +1062,10 @@
         </w:numPr>
       </w:pPr>
       <w:r>
-        <w:t xml:space="preserve">Java for Android (~1 year)</w:t>
-      </w:r>
-    </w:p>
-    <w:bookmarkEnd w:id="43"/>
-    <w:bookmarkStart w:id="44" w:name="interests"/>
-    <w:p>
-      <w:pPr>
-        <w:pStyle w:val="Heading3"/>
-      </w:pPr>
-      <w:r>
-        <w:t xml:space="preserve">Interests</w:t>
-      </w:r>
-    </w:p>
-    <w:p>
-      <w:pPr>
-        <w:pStyle w:val="Compact"/>
-        <w:numPr>
-          <w:ilvl w:val="0"/>
-          <w:numId w:val="1014"/>
-        </w:numPr>
-      </w:pPr>
-      <w:r>
-        <w:t xml:space="preserve">hobby-electronics, home automation, embedded-linux</w:t>
-      </w:r>
-    </w:p>
-    <w:p>
-      <w:pPr>
-        <w:pStyle w:val="Compact"/>
-        <w:numPr>
-          <w:ilvl w:val="0"/>
-          <w:numId w:val="1014"/>
-        </w:numPr>
-      </w:pPr>
-      <w:r>
-        <w:t xml:space="preserve">ice and rock climbing</w:t>
-      </w:r>
-    </w:p>
-    <w:p>
-      <w:pPr>
-        <w:pStyle w:val="Compact"/>
-        <w:numPr>
-          <w:ilvl w:val="0"/>
-          <w:numId w:val="1014"/>
-        </w:numPr>
-      </w:pPr>
-      <w:r>
-        <w:t xml:space="preserve">snowboarding and skiing</w:t>
-      </w:r>
-    </w:p>
-    <w:p>
-      <w:pPr>
-        <w:pStyle w:val="Compact"/>
-        <w:numPr>
-          <w:ilvl w:val="0"/>
-          <w:numId w:val="1014"/>
-        </w:numPr>
-      </w:pPr>
-      <w:r>
-        <w:t xml:space="preserve">gardening, cooking</w:t>
-      </w:r>
-    </w:p>
-    <w:p>
-      <w:pPr>
-        <w:pStyle w:val="Compact"/>
-        <w:numPr>
-          <w:ilvl w:val="0"/>
-          <w:numId w:val="1014"/>
-        </w:numPr>
-      </w:pPr>
-      <w:r>
-        <w:t xml:space="preserve">jetsking, boating, water skiing</w:t>
-      </w:r>
-    </w:p>
-    <w:p>
-      <w:pPr>
-        <w:pStyle w:val="Compact"/>
-        <w:numPr>
-          <w:ilvl w:val="0"/>
-          <w:numId w:val="1014"/>
-        </w:numPr>
-      </w:pPr>
-      <w:r>
         <w:t xml:space="preserve">camping, kayaking, volleyball</w:t>
       </w:r>
     </w:p>
-    <w:bookmarkEnd w:id="44"/>
-    <w:bookmarkEnd w:id="45"/>
+    <w:bookmarkEnd w:id="47"/>
     <w:sectPr>
       <w:pgSz w:h="15840" w:w="12240"/>
       <w:pgMar w:bottom="1080" w:footer="720" w:gutter="0" w:header="720" w:left="1080" w:right="1080" w:top="1080"/>
@@ -1373,9 +1293,6 @@
   <w:num w:numId="1013">
     <w:abstractNumId w:val="991"/>
   </w:num>
-  <w:num w:numId="1014">
-    <w:abstractNumId w:val="991"/>
-  </w:num>
 </w:numbering>
 </file>
 
@@ -1384,9 +1301,9 @@
   <w:docDefaults>
     <w:rPrDefault>
       <w:rPr>
-        <w:rFonts w:asciiTheme="minorHAnsi" w:cstheme="minorBidi" w:eastAsiaTheme="minorHAnsi" w:hAnsiTheme="minorHAnsi"/>
-        <w:sz w:val="24"/>
-        <w:szCs w:val="24"/>
+        <w:rFonts w:ascii="Calibri" w:cs="Calibri" w:eastAsia="Calibri" w:hAnsi="Calibri"/>
+        <w:sz w:val="22"/>
+        <w:szCs w:val="22"/>
         <w:lang w:bidi="ar-SA" w:eastAsia="en-US" w:val="en-US"/>
       </w:rPr>
     </w:rPrDefault>

</xml_diff>